<commit_message>
update follow new format
</commit_message>
<xml_diff>
--- a/static/GCN_000012.docx
+++ b/static/GCN_000012.docx
@@ -33,7 +33,7 @@
           <w:bCs/>
           <w:i/>
           <w:iCs/>
-          <w:color w:val="1a1917"/>
+          <w:color w:val="1a1a1a"/>
           <w:sz w:val="32"/>
           <w:szCs w:val="32"/>
         </w:rPr>
@@ -64,10 +64,10 @@
           <w:tcPr>
             <w:tcW w:type="dxa" w:w="1675"/>
             <w:tcBorders>
-              <w:top w:val="single" w:color="767171" w:sz="4"/>
-              <w:left w:val="single" w:color="767171" w:sz="4"/>
-              <w:bottom w:val="single" w:color="767171" w:sz="4"/>
-              <w:right w:val="single" w:color="767171" w:sz="4"/>
+              <w:top w:val="single" w:color="000000" w:sz="4"/>
+              <w:left w:val="single" w:color="000000" w:sz="4"/>
+              <w:bottom w:val="single" w:color="000000" w:sz="4"/>
+              <w:right w:val="single" w:color="000000" w:sz="4"/>
             </w:tcBorders>
             <w:tcMar>
               <w:top w:type="dxa" w:w="80"/>
@@ -89,7 +89,7 @@
                 <w:bCs/>
                 <w:i w:val="false"/>
                 <w:iCs w:val="false"/>
-                <w:color w:val="1a1917"/>
+                <w:color w:val="1a1a1a"/>
                 <w:sz w:val="20"/>
                 <w:szCs w:val="20"/>
               </w:rPr>
@@ -108,7 +108,7 @@
                 <w:bCs w:val="false"/>
                 <w:i/>
                 <w:iCs/>
-                <w:color w:val="1a1917"/>
+                <w:color w:val="1a1a1a"/>
                 <w:sz w:val="20"/>
                 <w:szCs w:val="20"/>
               </w:rPr>
@@ -120,10 +120,10 @@
           <w:tcPr>
             <w:tcW w:type="dxa" w:w="3426"/>
             <w:tcBorders>
-              <w:top w:val="single" w:color="767171" w:sz="4"/>
-              <w:left w:val="single" w:color="767171" w:sz="4"/>
-              <w:bottom w:val="single" w:color="767171" w:sz="4"/>
-              <w:right w:val="single" w:color="767171" w:sz="4"/>
+              <w:top w:val="single" w:color="000000" w:sz="4"/>
+              <w:left w:val="single" w:color="000000" w:sz="4"/>
+              <w:bottom w:val="single" w:color="000000" w:sz="4"/>
+              <w:right w:val="single" w:color="000000" w:sz="4"/>
             </w:tcBorders>
             <w:tcMar>
               <w:top w:type="dxa" w:w="80"/>
@@ -145,11 +145,11 @@
                 <w:bCs w:val="false"/>
                 <w:i w:val="false"/>
                 <w:iCs w:val="false"/>
-                <w:color w:val="1a1917"/>
-                <w:sz w:val="20"/>
-                <w:szCs w:val="20"/>
-              </w:rPr>
-              <w:t xml:space="preserve">Fan</w:t>
+                <w:color w:val="1a1a1a"/>
+                <w:sz w:val="20"/>
+                <w:szCs w:val="20"/>
+              </w:rPr>
+              <w:t xml:space="preserve">Hygonter</w:t>
             </w:r>
           </w:p>
         </w:tc>
@@ -157,10 +157,10 @@
           <w:tcPr>
             <w:tcW w:type="dxa" w:w="2513"/>
             <w:tcBorders>
-              <w:top w:val="single" w:color="767171" w:sz="4"/>
-              <w:left w:val="single" w:color="767171" w:sz="4"/>
-              <w:bottom w:val="single" w:color="767171" w:sz="4"/>
-              <w:right w:val="single" w:color="767171" w:sz="4"/>
+              <w:top w:val="single" w:color="000000" w:sz="4"/>
+              <w:left w:val="single" w:color="000000" w:sz="4"/>
+              <w:bottom w:val="single" w:color="000000" w:sz="4"/>
+              <w:right w:val="single" w:color="000000" w:sz="4"/>
             </w:tcBorders>
             <w:tcMar>
               <w:top w:type="dxa" w:w="80"/>
@@ -182,7 +182,7 @@
                 <w:bCs/>
                 <w:i w:val="false"/>
                 <w:iCs w:val="false"/>
-                <w:color w:val="1a1917"/>
+                <w:color w:val="1a1a1a"/>
                 <w:sz w:val="20"/>
                 <w:szCs w:val="20"/>
               </w:rPr>
@@ -201,7 +201,7 @@
                 <w:bCs w:val="false"/>
                 <w:i/>
                 <w:iCs/>
-                <w:color w:val="1a1917"/>
+                <w:color w:val="1a1a1a"/>
                 <w:sz w:val="20"/>
                 <w:szCs w:val="20"/>
               </w:rPr>
@@ -213,10 +213,10 @@
           <w:tcPr>
             <w:tcW w:type="dxa" w:w="1458"/>
             <w:tcBorders>
-              <w:top w:val="single" w:color="767171" w:sz="4"/>
-              <w:left w:val="single" w:color="767171" w:sz="4"/>
-              <w:bottom w:val="single" w:color="767171" w:sz="4"/>
-              <w:right w:val="single" w:color="767171" w:sz="4"/>
+              <w:top w:val="single" w:color="000000" w:sz="4"/>
+              <w:left w:val="single" w:color="000000" w:sz="4"/>
+              <w:bottom w:val="single" w:color="000000" w:sz="4"/>
+              <w:right w:val="single" w:color="000000" w:sz="4"/>
             </w:tcBorders>
             <w:tcMar>
               <w:top w:type="dxa" w:w="80"/>
@@ -238,7 +238,7 @@
                 <w:bCs w:val="false"/>
                 <w:i w:val="false"/>
                 <w:iCs w:val="false"/>
-                <w:color w:val="1a1917"/>
+                <w:color w:val="1a1a1a"/>
                 <w:sz w:val="20"/>
                 <w:szCs w:val="20"/>
               </w:rPr>
@@ -252,10 +252,10 @@
           <w:tcPr>
             <w:tcW w:type="dxa" w:w="1675"/>
             <w:tcBorders>
-              <w:top w:val="single" w:color="767171" w:sz="4"/>
-              <w:left w:val="single" w:color="767171" w:sz="4"/>
-              <w:bottom w:val="single" w:color="767171" w:sz="4"/>
-              <w:right w:val="single" w:color="767171" w:sz="4"/>
+              <w:top w:val="single" w:color="000000" w:sz="4"/>
+              <w:left w:val="single" w:color="000000" w:sz="4"/>
+              <w:bottom w:val="single" w:color="000000" w:sz="4"/>
+              <w:right w:val="single" w:color="000000" w:sz="4"/>
             </w:tcBorders>
             <w:tcMar>
               <w:top w:type="dxa" w:w="80"/>
@@ -277,7 +277,7 @@
                 <w:bCs/>
                 <w:i w:val="false"/>
                 <w:iCs w:val="false"/>
-                <w:color w:val="1a1917"/>
+                <w:color w:val="1a1a1a"/>
                 <w:sz w:val="20"/>
                 <w:szCs w:val="20"/>
               </w:rPr>
@@ -296,7 +296,7 @@
                 <w:bCs w:val="false"/>
                 <w:i/>
                 <w:iCs/>
-                <w:color w:val="1a1917"/>
+                <w:color w:val="1a1a1a"/>
                 <w:sz w:val="20"/>
                 <w:szCs w:val="20"/>
               </w:rPr>
@@ -308,10 +308,10 @@
           <w:tcPr>
             <w:tcW w:type="dxa" w:w="3426"/>
             <w:tcBorders>
-              <w:top w:val="single" w:color="767171" w:sz="4"/>
-              <w:left w:val="single" w:color="767171" w:sz="4"/>
-              <w:bottom w:val="single" w:color="767171" w:sz="4"/>
-              <w:right w:val="single" w:color="767171" w:sz="4"/>
+              <w:top w:val="single" w:color="000000" w:sz="4"/>
+              <w:left w:val="single" w:color="000000" w:sz="4"/>
+              <w:bottom w:val="single" w:color="000000" w:sz="4"/>
+              <w:right w:val="single" w:color="000000" w:sz="4"/>
             </w:tcBorders>
             <w:tcMar>
               <w:top w:type="dxa" w:w="80"/>
@@ -333,11 +333,11 @@
                 <w:bCs w:val="false"/>
                 <w:i w:val="false"/>
                 <w:iCs w:val="false"/>
-                <w:color w:val="1a1917"/>
-                <w:sz w:val="20"/>
-                <w:szCs w:val="20"/>
-              </w:rPr>
-              <w:t xml:space="preserve">Bồ Đào Nha</w:t>
+                <w:color w:val="1a1a1a"/>
+                <w:sz w:val="20"/>
+                <w:szCs w:val="20"/>
+              </w:rPr>
+              <w:t xml:space="preserve">China</w:t>
             </w:r>
           </w:p>
         </w:tc>
@@ -345,10 +345,10 @@
           <w:tcPr>
             <w:tcW w:type="dxa" w:w="2513"/>
             <w:tcBorders>
-              <w:top w:val="single" w:color="767171" w:sz="4"/>
-              <w:left w:val="single" w:color="767171" w:sz="4"/>
-              <w:bottom w:val="single" w:color="767171" w:sz="4"/>
-              <w:right w:val="single" w:color="767171" w:sz="4"/>
+              <w:top w:val="single" w:color="000000" w:sz="4"/>
+              <w:left w:val="single" w:color="000000" w:sz="4"/>
+              <w:bottom w:val="single" w:color="000000" w:sz="4"/>
+              <w:right w:val="single" w:color="000000" w:sz="4"/>
             </w:tcBorders>
             <w:tcMar>
               <w:top w:type="dxa" w:w="80"/>
@@ -370,7 +370,7 @@
                 <w:bCs/>
                 <w:i w:val="false"/>
                 <w:iCs w:val="false"/>
-                <w:color w:val="1a1917"/>
+                <w:color w:val="1a1a1a"/>
                 <w:sz w:val="20"/>
                 <w:szCs w:val="20"/>
               </w:rPr>
@@ -389,7 +389,7 @@
                 <w:bCs w:val="false"/>
                 <w:i/>
                 <w:iCs/>
-                <w:color w:val="1a1917"/>
+                <w:color w:val="1a1a1a"/>
                 <w:sz w:val="20"/>
                 <w:szCs w:val="20"/>
               </w:rPr>
@@ -401,10 +401,10 @@
           <w:tcPr>
             <w:tcW w:type="dxa" w:w="1458"/>
             <w:tcBorders>
-              <w:top w:val="single" w:color="767171" w:sz="4"/>
-              <w:left w:val="single" w:color="767171" w:sz="4"/>
-              <w:bottom w:val="single" w:color="767171" w:sz="4"/>
-              <w:right w:val="single" w:color="767171" w:sz="4"/>
+              <w:top w:val="single" w:color="000000" w:sz="4"/>
+              <w:left w:val="single" w:color="000000" w:sz="4"/>
+              <w:bottom w:val="single" w:color="000000" w:sz="4"/>
+              <w:right w:val="single" w:color="000000" w:sz="4"/>
             </w:tcBorders>
             <w:tcMar>
               <w:top w:type="dxa" w:w="80"/>
@@ -426,11 +426,11 @@
                 <w:bCs w:val="false"/>
                 <w:i w:val="false"/>
                 <w:iCs w:val="false"/>
-                <w:color w:val="1a1917"/>
-                <w:sz w:val="20"/>
-                <w:szCs w:val="20"/>
-              </w:rPr>
-              <w:t xml:space="preserve">–</w:t>
+                <w:color w:val="1a1a1a"/>
+                <w:sz w:val="20"/>
+                <w:szCs w:val="20"/>
+              </w:rPr>
+              <w:t xml:space="preserve">30.06.2026</w:t>
             </w:r>
           </w:p>
         </w:tc>
@@ -440,10 +440,10 @@
           <w:tcPr>
             <w:tcW w:type="dxa" w:w="1675"/>
             <w:tcBorders>
-              <w:top w:val="single" w:color="767171" w:sz="4"/>
-              <w:left w:val="single" w:color="767171" w:sz="4"/>
-              <w:bottom w:val="single" w:color="767171" w:sz="4"/>
-              <w:right w:val="single" w:color="767171" w:sz="4"/>
+              <w:top w:val="single" w:color="000000" w:sz="4"/>
+              <w:left w:val="single" w:color="000000" w:sz="4"/>
+              <w:bottom w:val="single" w:color="000000" w:sz="4"/>
+              <w:right w:val="single" w:color="000000" w:sz="4"/>
             </w:tcBorders>
             <w:tcMar>
               <w:top w:type="dxa" w:w="80"/>
@@ -465,7 +465,7 @@
                 <w:bCs/>
                 <w:i w:val="false"/>
                 <w:iCs w:val="false"/>
-                <w:color w:val="1a1917"/>
+                <w:color w:val="1a1a1a"/>
                 <w:sz w:val="20"/>
                 <w:szCs w:val="20"/>
               </w:rPr>
@@ -484,7 +484,7 @@
                 <w:bCs w:val="false"/>
                 <w:i/>
                 <w:iCs/>
-                <w:color w:val="1a1917"/>
+                <w:color w:val="1a1a1a"/>
                 <w:sz w:val="20"/>
                 <w:szCs w:val="20"/>
               </w:rPr>
@@ -496,10 +496,10 @@
           <w:tcPr>
             <w:tcW w:type="dxa" w:w="3426"/>
             <w:tcBorders>
-              <w:top w:val="single" w:color="767171" w:sz="4"/>
-              <w:left w:val="single" w:color="767171" w:sz="4"/>
-              <w:bottom w:val="single" w:color="767171" w:sz="4"/>
-              <w:right w:val="single" w:color="767171" w:sz="4"/>
+              <w:top w:val="single" w:color="000000" w:sz="4"/>
+              <w:left w:val="single" w:color="000000" w:sz="4"/>
+              <w:bottom w:val="single" w:color="000000" w:sz="4"/>
+              <w:right w:val="single" w:color="000000" w:sz="4"/>
             </w:tcBorders>
             <w:tcMar>
               <w:top w:type="dxa" w:w="80"/>
@@ -521,11 +521,11 @@
                 <w:bCs w:val="false"/>
                 <w:i w:val="false"/>
                 <w:iCs w:val="false"/>
-                <w:color w:val="1a1917"/>
-                <w:sz w:val="20"/>
-                <w:szCs w:val="20"/>
-              </w:rPr>
-              <w:t xml:space="preserve">–</w:t>
+                <w:color w:val="1a1a1a"/>
+                <w:sz w:val="20"/>
+                <w:szCs w:val="20"/>
+              </w:rPr>
+              <w:t xml:space="preserve">3LWED4705FW</w:t>
             </w:r>
           </w:p>
         </w:tc>
@@ -533,10 +533,10 @@
           <w:tcPr>
             <w:tcW w:type="dxa" w:w="2513"/>
             <w:tcBorders>
-              <w:top w:val="single" w:color="767171" w:sz="4"/>
-              <w:left w:val="single" w:color="767171" w:sz="4"/>
-              <w:bottom w:val="single" w:color="767171" w:sz="4"/>
-              <w:right w:val="single" w:color="767171" w:sz="4"/>
+              <w:top w:val="single" w:color="000000" w:sz="4"/>
+              <w:left w:val="single" w:color="000000" w:sz="4"/>
+              <w:bottom w:val="single" w:color="000000" w:sz="4"/>
+              <w:right w:val="single" w:color="000000" w:sz="4"/>
             </w:tcBorders>
             <w:tcMar>
               <w:top w:type="dxa" w:w="80"/>
@@ -558,7 +558,7 @@
                 <w:bCs/>
                 <w:i w:val="false"/>
                 <w:iCs w:val="false"/>
-                <w:color w:val="1a1917"/>
+                <w:color w:val="1a1a1a"/>
                 <w:sz w:val="20"/>
                 <w:szCs w:val="20"/>
               </w:rPr>
@@ -577,7 +577,7 @@
                 <w:bCs w:val="false"/>
                 <w:i/>
                 <w:iCs/>
-                <w:color w:val="1a1917"/>
+                <w:color w:val="1a1a1a"/>
                 <w:sz w:val="20"/>
                 <w:szCs w:val="20"/>
               </w:rPr>
@@ -589,10 +589,10 @@
           <w:tcPr>
             <w:tcW w:type="dxa" w:w="1458"/>
             <w:tcBorders>
-              <w:top w:val="single" w:color="767171" w:sz="4"/>
-              <w:left w:val="single" w:color="767171" w:sz="4"/>
-              <w:bottom w:val="single" w:color="767171" w:sz="4"/>
-              <w:right w:val="single" w:color="767171" w:sz="4"/>
+              <w:top w:val="single" w:color="000000" w:sz="4"/>
+              <w:left w:val="single" w:color="000000" w:sz="4"/>
+              <w:bottom w:val="single" w:color="000000" w:sz="4"/>
+              <w:right w:val="single" w:color="000000" w:sz="4"/>
             </w:tcBorders>
             <w:tcMar>
               <w:top w:type="dxa" w:w="80"/>
@@ -614,11 +614,11 @@
                 <w:bCs w:val="false"/>
                 <w:i w:val="false"/>
                 <w:iCs w:val="false"/>
-                <w:color w:val="1a1917"/>
-                <w:sz w:val="20"/>
-                <w:szCs w:val="20"/>
-              </w:rPr>
-              <w:t xml:space="preserve">–</w:t>
+                <w:color w:val="1a1a1a"/>
+                <w:sz w:val="20"/>
+                <w:szCs w:val="20"/>
+              </w:rPr>
+              <w:t xml:space="preserve">12.12.2000</w:t>
             </w:r>
           </w:p>
         </w:tc>
@@ -628,10 +628,10 @@
           <w:tcPr>
             <w:tcW w:type="dxa" w:w="1675"/>
             <w:tcBorders>
-              <w:top w:val="single" w:color="767171" w:sz="4"/>
-              <w:left w:val="single" w:color="767171" w:sz="4"/>
-              <w:bottom w:val="single" w:color="767171" w:sz="4"/>
-              <w:right w:val="single" w:color="767171" w:sz="4"/>
+              <w:top w:val="single" w:color="000000" w:sz="4"/>
+              <w:left w:val="single" w:color="000000" w:sz="4"/>
+              <w:bottom w:val="single" w:color="000000" w:sz="4"/>
+              <w:right w:val="single" w:color="000000" w:sz="4"/>
             </w:tcBorders>
             <w:tcMar>
               <w:top w:type="dxa" w:w="80"/>
@@ -653,7 +653,7 @@
                 <w:bCs/>
                 <w:i w:val="false"/>
                 <w:iCs w:val="false"/>
-                <w:color w:val="1a1917"/>
+                <w:color w:val="1a1a1a"/>
                 <w:sz w:val="20"/>
                 <w:szCs w:val="20"/>
               </w:rPr>
@@ -665,10 +665,10 @@
           <w:tcPr>
             <w:tcW w:type="dxa" w:w="3426"/>
             <w:tcBorders>
-              <w:top w:val="single" w:color="767171" w:sz="4"/>
-              <w:left w:val="single" w:color="767171" w:sz="4"/>
-              <w:bottom w:val="single" w:color="767171" w:sz="4"/>
-              <w:right w:val="single" w:color="767171" w:sz="4"/>
+              <w:top w:val="single" w:color="000000" w:sz="4"/>
+              <w:left w:val="single" w:color="000000" w:sz="4"/>
+              <w:bottom w:val="single" w:color="000000" w:sz="4"/>
+              <w:right w:val="single" w:color="000000" w:sz="4"/>
             </w:tcBorders>
             <w:tcMar>
               <w:top w:type="dxa" w:w="80"/>
@@ -690,11 +690,11 @@
                 <w:bCs w:val="false"/>
                 <w:i w:val="false"/>
                 <w:iCs w:val="false"/>
-                <w:color w:val="1a1917"/>
-                <w:sz w:val="20"/>
-                <w:szCs w:val="20"/>
-              </w:rPr>
-              <w:t xml:space="preserve">H.045</w:t>
+                <w:color w:val="1a1a1a"/>
+                <w:sz w:val="20"/>
+                <w:szCs w:val="20"/>
+              </w:rPr>
+              <w:t xml:space="preserve">H.03</w:t>
             </w:r>
           </w:p>
         </w:tc>
@@ -702,10 +702,10 @@
           <w:tcPr>
             <w:tcW w:type="dxa" w:w="2513"/>
             <w:tcBorders>
-              <w:top w:val="single" w:color="767171" w:sz="4"/>
-              <w:left w:val="single" w:color="767171" w:sz="4"/>
-              <w:bottom w:val="single" w:color="767171" w:sz="4"/>
-              <w:right w:val="single" w:color="767171" w:sz="4"/>
+              <w:top w:val="single" w:color="000000" w:sz="4"/>
+              <w:left w:val="single" w:color="000000" w:sz="4"/>
+              <w:bottom w:val="single" w:color="000000" w:sz="4"/>
+              <w:right w:val="single" w:color="000000" w:sz="4"/>
             </w:tcBorders>
             <w:tcMar>
               <w:top w:type="dxa" w:w="80"/>
@@ -727,7 +727,7 @@
                 <w:bCs/>
                 <w:i w:val="false"/>
                 <w:iCs w:val="false"/>
-                <w:color w:val="1a1917"/>
+                <w:color w:val="1a1a1a"/>
                 <w:sz w:val="20"/>
                 <w:szCs w:val="20"/>
               </w:rPr>
@@ -739,10 +739,10 @@
           <w:tcPr>
             <w:tcW w:type="dxa" w:w="1458"/>
             <w:tcBorders>
-              <w:top w:val="single" w:color="767171" w:sz="4"/>
-              <w:left w:val="single" w:color="767171" w:sz="4"/>
-              <w:bottom w:val="single" w:color="767171" w:sz="4"/>
-              <w:right w:val="single" w:color="767171" w:sz="4"/>
+              <w:top w:val="single" w:color="000000" w:sz="4"/>
+              <w:left w:val="single" w:color="000000" w:sz="4"/>
+              <w:bottom w:val="single" w:color="000000" w:sz="4"/>
+              <w:right w:val="single" w:color="000000" w:sz="4"/>
             </w:tcBorders>
             <w:tcMar>
               <w:top w:type="dxa" w:w="80"/>
@@ -764,7 +764,7 @@
                 <w:bCs w:val="false"/>
                 <w:i w:val="false"/>
                 <w:iCs w:val="false"/>
-                <w:color w:val="1a1917"/>
+                <w:color w:val="1a1a1a"/>
                 <w:sz w:val="20"/>
                 <w:szCs w:val="20"/>
               </w:rPr>
@@ -778,10 +778,10 @@
           <w:tcPr>
             <w:tcW w:type="dxa" w:w="1675"/>
             <w:tcBorders>
-              <w:top w:val="single" w:color="767171" w:sz="4"/>
-              <w:left w:val="single" w:color="767171" w:sz="4"/>
-              <w:bottom w:val="single" w:color="767171" w:sz="4"/>
-              <w:right w:val="single" w:color="767171" w:sz="4"/>
+              <w:top w:val="single" w:color="000000" w:sz="4"/>
+              <w:left w:val="single" w:color="000000" w:sz="4"/>
+              <w:bottom w:val="single" w:color="000000" w:sz="4"/>
+              <w:right w:val="single" w:color="000000" w:sz="4"/>
             </w:tcBorders>
             <w:tcMar>
               <w:top w:type="dxa" w:w="80"/>
@@ -803,7 +803,7 @@
                 <w:bCs/>
                 <w:i w:val="false"/>
                 <w:iCs w:val="false"/>
-                <w:color w:val="1a1917"/>
+                <w:color w:val="1a1a1a"/>
                 <w:sz w:val="20"/>
                 <w:szCs w:val="20"/>
               </w:rPr>
@@ -822,7 +822,7 @@
                 <w:bCs w:val="false"/>
                 <w:i/>
                 <w:iCs/>
-                <w:color w:val="1a1917"/>
+                <w:color w:val="1a1a1a"/>
                 <w:sz w:val="20"/>
                 <w:szCs w:val="20"/>
               </w:rPr>
@@ -834,10 +834,10 @@
           <w:tcPr>
             <w:tcW w:type="dxa" w:w="3426"/>
             <w:tcBorders>
-              <w:top w:val="single" w:color="767171" w:sz="4"/>
-              <w:left w:val="single" w:color="767171" w:sz="4"/>
-              <w:bottom w:val="single" w:color="767171" w:sz="4"/>
-              <w:right w:val="single" w:color="767171" w:sz="4"/>
+              <w:top w:val="single" w:color="000000" w:sz="4"/>
+              <w:left w:val="single" w:color="000000" w:sz="4"/>
+              <w:bottom w:val="single" w:color="000000" w:sz="4"/>
+              <w:right w:val="single" w:color="000000" w:sz="4"/>
             </w:tcBorders>
             <w:tcMar>
               <w:top w:type="dxa" w:w="80"/>
@@ -859,11 +859,11 @@
                 <w:bCs w:val="false"/>
                 <w:i w:val="false"/>
                 <w:iCs w:val="false"/>
-                <w:color w:val="1a1917"/>
-                <w:sz w:val="20"/>
-                <w:szCs w:val="20"/>
-              </w:rPr>
-              <w:t xml:space="preserve">–</w:t>
+                <w:color w:val="1a1a1a"/>
+                <w:sz w:val="20"/>
+                <w:szCs w:val="20"/>
+              </w:rPr>
+              <w:t xml:space="preserve">65796</w:t>
             </w:r>
           </w:p>
         </w:tc>
@@ -871,10 +871,10 @@
           <w:tcPr>
             <w:tcW w:type="dxa" w:w="2513"/>
             <w:tcBorders>
-              <w:top w:val="single" w:color="767171" w:sz="4"/>
-              <w:left w:val="single" w:color="767171" w:sz="4"/>
-              <w:bottom w:val="single" w:color="767171" w:sz="4"/>
-              <w:right w:val="single" w:color="767171" w:sz="4"/>
+              <w:top w:val="single" w:color="000000" w:sz="4"/>
+              <w:left w:val="single" w:color="000000" w:sz="4"/>
+              <w:bottom w:val="single" w:color="000000" w:sz="4"/>
+              <w:right w:val="single" w:color="000000" w:sz="4"/>
             </w:tcBorders>
             <w:tcMar>
               <w:top w:type="dxa" w:w="80"/>
@@ -896,7 +896,7 @@
                 <w:bCs/>
                 <w:i w:val="false"/>
                 <w:iCs w:val="false"/>
-                <w:color w:val="1a1917"/>
+                <w:color w:val="1a1a1a"/>
                 <w:sz w:val="20"/>
                 <w:szCs w:val="20"/>
               </w:rPr>
@@ -908,10 +908,10 @@
           <w:tcPr>
             <w:tcW w:type="dxa" w:w="1458"/>
             <w:tcBorders>
-              <w:top w:val="single" w:color="767171" w:sz="4"/>
-              <w:left w:val="single" w:color="767171" w:sz="4"/>
-              <w:bottom w:val="single" w:color="767171" w:sz="4"/>
-              <w:right w:val="single" w:color="767171" w:sz="4"/>
+              <w:top w:val="single" w:color="000000" w:sz="4"/>
+              <w:left w:val="single" w:color="000000" w:sz="4"/>
+              <w:bottom w:val="single" w:color="000000" w:sz="4"/>
+              <w:right w:val="single" w:color="000000" w:sz="4"/>
             </w:tcBorders>
             <w:tcMar>
               <w:top w:type="dxa" w:w="80"/>
@@ -933,7 +933,7 @@
                 <w:bCs w:val="false"/>
                 <w:i w:val="false"/>
                 <w:iCs w:val="false"/>
-                <w:color w:val="1a1917"/>
+                <w:color w:val="1a1a1a"/>
                 <w:sz w:val="20"/>
                 <w:szCs w:val="20"/>
               </w:rPr>
@@ -947,10 +947,10 @@
           <w:tcPr>
             <w:tcW w:type="dxa" w:w="1675"/>
             <w:tcBorders>
-              <w:top w:val="single" w:color="767171" w:sz="4"/>
-              <w:left w:val="single" w:color="767171" w:sz="4"/>
-              <w:bottom w:val="single" w:color="767171" w:sz="4"/>
-              <w:right w:val="single" w:color="767171" w:sz="4"/>
+              <w:top w:val="single" w:color="000000" w:sz="4"/>
+              <w:left w:val="single" w:color="000000" w:sz="4"/>
+              <w:bottom w:val="single" w:color="000000" w:sz="4"/>
+              <w:right w:val="single" w:color="000000" w:sz="4"/>
             </w:tcBorders>
             <w:tcMar>
               <w:top w:type="dxa" w:w="80"/>
@@ -972,7 +972,7 @@
                 <w:bCs/>
                 <w:i w:val="false"/>
                 <w:iCs w:val="false"/>
-                <w:color w:val="1a1917"/>
+                <w:color w:val="1a1a1a"/>
                 <w:sz w:val="20"/>
                 <w:szCs w:val="20"/>
               </w:rPr>
@@ -991,7 +991,7 @@
                 <w:bCs w:val="false"/>
                 <w:i/>
                 <w:iCs/>
-                <w:color w:val="1a1917"/>
+                <w:color w:val="1a1a1a"/>
                 <w:sz w:val="20"/>
                 <w:szCs w:val="20"/>
               </w:rPr>
@@ -1004,10 +1004,10 @@
             <w:tcW w:type="dxa" w:w="7397"/>
             <w:gridSpan w:val="3"/>
             <w:tcBorders>
-              <w:top w:val="single" w:color="767171" w:sz="4"/>
-              <w:left w:val="single" w:color="767171" w:sz="4"/>
-              <w:bottom w:val="single" w:color="767171" w:sz="4"/>
-              <w:right w:val="single" w:color="767171" w:sz="4"/>
+              <w:top w:val="single" w:color="000000" w:sz="4"/>
+              <w:left w:val="single" w:color="000000" w:sz="4"/>
+              <w:bottom w:val="single" w:color="000000" w:sz="4"/>
+              <w:right w:val="single" w:color="000000" w:sz="4"/>
             </w:tcBorders>
             <w:tcMar>
               <w:top w:type="dxa" w:w="80"/>
@@ -1029,11 +1029,11 @@
                 <w:bCs/>
                 <w:i w:val="false"/>
                 <w:iCs w:val="false"/>
-                <w:color w:val="1a1917"/>
-                <w:sz w:val="20"/>
-                <w:szCs w:val="20"/>
-              </w:rPr>
-              <w:t xml:space="preserve">CÔNG TY TNHH PAIHONG VIỆT NAM</w:t>
+                <w:color w:val="1a1a1a"/>
+                <w:sz w:val="20"/>
+                <w:szCs w:val="20"/>
+              </w:rPr>
+              <w:t xml:space="preserve">Mai Hoàng Anh</w:t>
             </w:r>
           </w:p>
         </w:tc>
@@ -1043,10 +1043,10 @@
           <w:tcPr>
             <w:tcW w:type="dxa" w:w="1675"/>
             <w:tcBorders>
-              <w:top w:val="single" w:color="767171" w:sz="4"/>
-              <w:left w:val="single" w:color="767171" w:sz="4"/>
-              <w:bottom w:val="single" w:color="767171" w:sz="4"/>
-              <w:right w:val="single" w:color="767171" w:sz="4"/>
+              <w:top w:val="single" w:color="000000" w:sz="4"/>
+              <w:left w:val="single" w:color="000000" w:sz="4"/>
+              <w:bottom w:val="single" w:color="000000" w:sz="4"/>
+              <w:right w:val="single" w:color="000000" w:sz="4"/>
             </w:tcBorders>
             <w:tcMar>
               <w:top w:type="dxa" w:w="80"/>
@@ -1068,7 +1068,7 @@
                 <w:bCs/>
                 <w:i w:val="false"/>
                 <w:iCs w:val="false"/>
-                <w:color w:val="1a1917"/>
+                <w:color w:val="1a1a1a"/>
                 <w:sz w:val="20"/>
                 <w:szCs w:val="20"/>
               </w:rPr>
@@ -1087,7 +1087,7 @@
                 <w:bCs w:val="false"/>
                 <w:i/>
                 <w:iCs/>
-                <w:color w:val="1a1917"/>
+                <w:color w:val="1a1a1a"/>
                 <w:sz w:val="20"/>
                 <w:szCs w:val="20"/>
               </w:rPr>
@@ -1100,10 +1100,10 @@
             <w:tcW w:type="dxa" w:w="7397"/>
             <w:gridSpan w:val="3"/>
             <w:tcBorders>
-              <w:top w:val="single" w:color="767171" w:sz="4"/>
-              <w:left w:val="single" w:color="767171" w:sz="4"/>
-              <w:bottom w:val="single" w:color="767171" w:sz="4"/>
-              <w:right w:val="single" w:color="767171" w:sz="4"/>
+              <w:top w:val="single" w:color="000000" w:sz="4"/>
+              <w:left w:val="single" w:color="000000" w:sz="4"/>
+              <w:bottom w:val="single" w:color="000000" w:sz="4"/>
+              <w:right w:val="single" w:color="000000" w:sz="4"/>
             </w:tcBorders>
             <w:tcMar>
               <w:top w:type="dxa" w:w="80"/>
@@ -1125,11 +1125,11 @@
                 <w:bCs/>
                 <w:i w:val="false"/>
                 <w:iCs w:val="false"/>
-                <w:color w:val="1a1917"/>
-                <w:sz w:val="20"/>
-                <w:szCs w:val="20"/>
-              </w:rPr>
-              <w:t xml:space="preserve">–</w:t>
+                <w:color w:val="1a1a1a"/>
+                <w:sz w:val="20"/>
+                <w:szCs w:val="20"/>
+              </w:rPr>
+              <w:t xml:space="preserve">72, đường Ra Ga, Phường Bình Chánh, TP.HCM</w:t>
             </w:r>
           </w:p>
         </w:tc>
@@ -1147,7 +1147,7 @@
           <w:bCs w:val="false"/>
           <w:i w:val="false"/>
           <w:iCs w:val="false"/>
-          <w:color w:val="1a1917"/>
+          <w:color w:val="1a1a1a"/>
           <w:sz w:val="20"/>
           <w:szCs w:val="20"/>
         </w:rPr>
@@ -1178,10 +1178,10 @@
           <w:tcPr>
             <w:tcW w:type="dxa" w:w="1675"/>
             <w:tcBorders>
-              <w:top w:val="single" w:color="767171" w:sz="4"/>
-              <w:left w:val="single" w:color="767171" w:sz="4"/>
-              <w:bottom w:val="single" w:color="767171" w:sz="4"/>
-              <w:right w:val="single" w:color="767171" w:sz="4"/>
+              <w:top w:val="single" w:color="000000" w:sz="4"/>
+              <w:left w:val="single" w:color="000000" w:sz="4"/>
+              <w:bottom w:val="single" w:color="000000" w:sz="4"/>
+              <w:right w:val="single" w:color="000000" w:sz="4"/>
             </w:tcBorders>
             <w:tcMar>
               <w:top w:type="dxa" w:w="80"/>
@@ -1203,7 +1203,7 @@
                 <w:bCs/>
                 <w:i w:val="false"/>
                 <w:iCs w:val="false"/>
-                <w:color w:val="1a1917"/>
+                <w:color w:val="1a1a1a"/>
                 <w:sz w:val="20"/>
                 <w:szCs w:val="20"/>
               </w:rPr>
@@ -1222,7 +1222,7 @@
                 <w:bCs w:val="false"/>
                 <w:i/>
                 <w:iCs/>
-                <w:color w:val="1a1917"/>
+                <w:color w:val="1a1a1a"/>
                 <w:sz w:val="20"/>
                 <w:szCs w:val="20"/>
               </w:rPr>
@@ -1234,10 +1234,10 @@
           <w:tcPr>
             <w:tcW w:type="dxa" w:w="3426"/>
             <w:tcBorders>
-              <w:top w:val="single" w:color="767171" w:sz="4"/>
-              <w:left w:val="single" w:color="767171" w:sz="4"/>
-              <w:bottom w:val="single" w:color="767171" w:sz="4"/>
-              <w:right w:val="single" w:color="767171" w:sz="4"/>
+              <w:top w:val="single" w:color="000000" w:sz="4"/>
+              <w:left w:val="single" w:color="000000" w:sz="4"/>
+              <w:bottom w:val="single" w:color="000000" w:sz="4"/>
+              <w:right w:val="single" w:color="000000" w:sz="4"/>
             </w:tcBorders>
             <w:tcMar>
               <w:top w:type="dxa" w:w="80"/>
@@ -1259,7 +1259,7 @@
                 <w:bCs w:val="false"/>
                 <w:i w:val="false"/>
                 <w:iCs w:val="false"/>
-                <w:color w:val="1a1917"/>
+                <w:color w:val="1a1a1a"/>
                 <w:sz w:val="20"/>
                 <w:szCs w:val="20"/>
               </w:rPr>
@@ -1271,10 +1271,10 @@
           <w:tcPr>
             <w:tcW w:type="dxa" w:w="2513"/>
             <w:tcBorders>
-              <w:top w:val="single" w:color="767171" w:sz="4"/>
-              <w:left w:val="single" w:color="767171" w:sz="4"/>
-              <w:bottom w:val="single" w:color="767171" w:sz="4"/>
-              <w:right w:val="single" w:color="767171" w:sz="4"/>
+              <w:top w:val="single" w:color="000000" w:sz="4"/>
+              <w:left w:val="single" w:color="000000" w:sz="4"/>
+              <w:bottom w:val="single" w:color="000000" w:sz="4"/>
+              <w:right w:val="single" w:color="000000" w:sz="4"/>
             </w:tcBorders>
             <w:tcMar>
               <w:top w:type="dxa" w:w="80"/>
@@ -1296,7 +1296,7 @@
                 <w:bCs/>
                 <w:i w:val="false"/>
                 <w:iCs w:val="false"/>
-                <w:color w:val="1a1917"/>
+                <w:color w:val="1a1a1a"/>
                 <w:sz w:val="20"/>
                 <w:szCs w:val="20"/>
               </w:rPr>
@@ -1315,7 +1315,7 @@
                 <w:bCs w:val="false"/>
                 <w:i/>
                 <w:iCs/>
-                <w:color w:val="1a1917"/>
+                <w:color w:val="1a1a1a"/>
                 <w:sz w:val="20"/>
                 <w:szCs w:val="20"/>
               </w:rPr>
@@ -1327,10 +1327,10 @@
           <w:tcPr>
             <w:tcW w:type="dxa" w:w="1458"/>
             <w:tcBorders>
-              <w:top w:val="single" w:color="767171" w:sz="4"/>
-              <w:left w:val="single" w:color="767171" w:sz="4"/>
-              <w:bottom w:val="single" w:color="767171" w:sz="4"/>
-              <w:right w:val="single" w:color="767171" w:sz="4"/>
+              <w:top w:val="single" w:color="000000" w:sz="4"/>
+              <w:left w:val="single" w:color="000000" w:sz="4"/>
+              <w:bottom w:val="single" w:color="000000" w:sz="4"/>
+              <w:right w:val="single" w:color="000000" w:sz="4"/>
             </w:tcBorders>
             <w:tcMar>
               <w:top w:type="dxa" w:w="80"/>
@@ -1352,7 +1352,7 @@
                 <w:bCs w:val="false"/>
                 <w:i w:val="false"/>
                 <w:iCs w:val="false"/>
-                <w:color w:val="1a1917"/>
+                <w:color w:val="1a1a1a"/>
                 <w:sz w:val="20"/>
                 <w:szCs w:val="20"/>
               </w:rPr>
@@ -1366,10 +1366,10 @@
           <w:tcPr>
             <w:tcW w:type="dxa" w:w="1675"/>
             <w:tcBorders>
-              <w:top w:val="single" w:color="767171" w:sz="4"/>
-              <w:left w:val="single" w:color="767171" w:sz="4"/>
-              <w:bottom w:val="single" w:color="767171" w:sz="4"/>
-              <w:right w:val="single" w:color="767171" w:sz="4"/>
+              <w:top w:val="single" w:color="000000" w:sz="4"/>
+              <w:left w:val="single" w:color="000000" w:sz="4"/>
+              <w:bottom w:val="single" w:color="000000" w:sz="4"/>
+              <w:right w:val="single" w:color="000000" w:sz="4"/>
             </w:tcBorders>
             <w:tcMar>
               <w:top w:type="dxa" w:w="80"/>
@@ -1391,7 +1391,7 @@
                 <w:bCs w:val="false"/>
                 <w:i w:val="false"/>
                 <w:iCs w:val="false"/>
-                <w:color w:val="1a1917"/>
+                <w:color w:val="1a1a1a"/>
                 <w:sz w:val="16"/>
                 <w:szCs w:val="16"/>
               </w:rPr>
@@ -1403,10 +1403,10 @@
           <w:tcPr>
             <w:tcW w:type="dxa" w:w="3426"/>
             <w:tcBorders>
-              <w:top w:val="single" w:color="767171" w:sz="4"/>
-              <w:left w:val="single" w:color="767171" w:sz="4"/>
-              <w:bottom w:val="single" w:color="767171" w:sz="4"/>
-              <w:right w:val="single" w:color="767171" w:sz="4"/>
+              <w:top w:val="single" w:color="000000" w:sz="4"/>
+              <w:left w:val="single" w:color="000000" w:sz="4"/>
+              <w:bottom w:val="single" w:color="000000" w:sz="4"/>
+              <w:right w:val="single" w:color="000000" w:sz="4"/>
             </w:tcBorders>
             <w:tcMar>
               <w:top w:type="dxa" w:w="80"/>
@@ -1428,7 +1428,7 @@
                 <w:bCs w:val="false"/>
                 <w:i w:val="false"/>
                 <w:iCs w:val="false"/>
-                <w:color w:val="1a1917"/>
+                <w:color w:val="1a1a1a"/>
                 <w:sz w:val="16"/>
                 <w:szCs w:val="16"/>
               </w:rPr>
@@ -1440,10 +1440,10 @@
           <w:tcPr>
             <w:tcW w:type="dxa" w:w="2513"/>
             <w:tcBorders>
-              <w:top w:val="single" w:color="767171" w:sz="4"/>
-              <w:left w:val="single" w:color="767171" w:sz="4"/>
-              <w:bottom w:val="single" w:color="767171" w:sz="4"/>
-              <w:right w:val="single" w:color="767171" w:sz="4"/>
+              <w:top w:val="single" w:color="000000" w:sz="4"/>
+              <w:left w:val="single" w:color="000000" w:sz="4"/>
+              <w:bottom w:val="single" w:color="000000" w:sz="4"/>
+              <w:right w:val="single" w:color="000000" w:sz="4"/>
             </w:tcBorders>
             <w:tcMar>
               <w:top w:type="dxa" w:w="80"/>
@@ -1465,7 +1465,7 @@
                 <w:bCs w:val="false"/>
                 <w:i w:val="false"/>
                 <w:iCs w:val="false"/>
-                <w:color w:val="1a1917"/>
+                <w:color w:val="1a1a1a"/>
                 <w:sz w:val="16"/>
                 <w:szCs w:val="16"/>
               </w:rPr>
@@ -1477,10 +1477,10 @@
           <w:tcPr>
             <w:tcW w:type="dxa" w:w="1458"/>
             <w:tcBorders>
-              <w:top w:val="single" w:color="767171" w:sz="4"/>
-              <w:left w:val="single" w:color="767171" w:sz="4"/>
-              <w:bottom w:val="single" w:color="767171" w:sz="4"/>
-              <w:right w:val="single" w:color="767171" w:sz="4"/>
+              <w:top w:val="single" w:color="000000" w:sz="4"/>
+              <w:left w:val="single" w:color="000000" w:sz="4"/>
+              <w:bottom w:val="single" w:color="000000" w:sz="4"/>
+              <w:right w:val="single" w:color="000000" w:sz="4"/>
             </w:tcBorders>
             <w:tcMar>
               <w:top w:type="dxa" w:w="80"/>
@@ -1502,7 +1502,7 @@
                 <w:bCs w:val="false"/>
                 <w:i w:val="false"/>
                 <w:iCs w:val="false"/>
-                <w:color w:val="1a1917"/>
+                <w:color w:val="1a1a1a"/>
                 <w:sz w:val="16"/>
                 <w:szCs w:val="16"/>
               </w:rPr>
@@ -1516,10 +1516,10 @@
           <w:tcPr>
             <w:tcW w:type="dxa" w:w="1675"/>
             <w:tcBorders>
-              <w:top w:val="single" w:color="767171" w:sz="4"/>
-              <w:left w:val="single" w:color="767171" w:sz="4"/>
-              <w:bottom w:val="single" w:color="767171" w:sz="4"/>
-              <w:right w:val="single" w:color="767171" w:sz="4"/>
+              <w:top w:val="single" w:color="000000" w:sz="4"/>
+              <w:left w:val="single" w:color="000000" w:sz="4"/>
+              <w:bottom w:val="single" w:color="000000" w:sz="4"/>
+              <w:right w:val="single" w:color="000000" w:sz="4"/>
             </w:tcBorders>
             <w:tcMar>
               <w:top w:type="dxa" w:w="80"/>
@@ -1541,7 +1541,7 @@
                 <w:bCs/>
                 <w:i w:val="false"/>
                 <w:iCs w:val="false"/>
-                <w:color w:val="1a1917"/>
+                <w:color w:val="1a1a1a"/>
                 <w:sz w:val="20"/>
                 <w:szCs w:val="20"/>
               </w:rPr>
@@ -1560,7 +1560,7 @@
                 <w:bCs w:val="false"/>
                 <w:i/>
                 <w:iCs/>
-                <w:color w:val="1a1917"/>
+                <w:color w:val="1a1a1a"/>
                 <w:sz w:val="20"/>
                 <w:szCs w:val="20"/>
               </w:rPr>
@@ -1573,10 +1573,10 @@
             <w:tcW w:type="dxa" w:w="7397"/>
             <w:gridSpan w:val="3"/>
             <w:tcBorders>
-              <w:top w:val="single" w:color="767171" w:sz="4"/>
-              <w:left w:val="single" w:color="767171" w:sz="4"/>
-              <w:bottom w:val="single" w:color="767171" w:sz="4"/>
-              <w:right w:val="single" w:color="767171" w:sz="4"/>
+              <w:top w:val="single" w:color="000000" w:sz="4"/>
+              <w:left w:val="single" w:color="000000" w:sz="4"/>
+              <w:bottom w:val="single" w:color="000000" w:sz="4"/>
+              <w:right w:val="single" w:color="000000" w:sz="4"/>
             </w:tcBorders>
             <w:tcMar>
               <w:top w:type="dxa" w:w="80"/>
@@ -1598,11 +1598,11 @@
                 <w:bCs/>
                 <w:i w:val="false"/>
                 <w:iCs w:val="false"/>
-                <w:color w:val="1a1917"/>
-                <w:sz w:val="20"/>
-                <w:szCs w:val="20"/>
-              </w:rPr>
-              <w:t xml:space="preserve">CÔNG TY TNHH PAIHONG VIỆT NAM</w:t>
+                <w:color w:val="1a1a1a"/>
+                <w:sz w:val="20"/>
+                <w:szCs w:val="20"/>
+              </w:rPr>
+              <w:t xml:space="preserve">Mai Hoàng Anh</w:t>
             </w:r>
           </w:p>
           <w:p>
@@ -1617,11 +1617,11 @@
                 <w:bCs w:val="false"/>
                 <w:i w:val="false"/>
                 <w:iCs w:val="false"/>
-                <w:color w:val="1a1917"/>
-                <w:sz w:val="20"/>
-                <w:szCs w:val="20"/>
-              </w:rPr>
-              <w:t xml:space="preserve"/>
+                <w:color w:val="1a1a1a"/>
+                <w:sz w:val="20"/>
+                <w:szCs w:val="20"/>
+              </w:rPr>
+              <w:t xml:space="preserve">72, đường Ra Ga, Phường Bình Chánh, TP.HCM</w:t>
             </w:r>
           </w:p>
         </w:tc>
@@ -1631,10 +1631,10 @@
           <w:tcPr>
             <w:tcW w:type="dxa" w:w="1675"/>
             <w:tcBorders>
-              <w:top w:val="single" w:color="767171" w:sz="4"/>
-              <w:left w:val="single" w:color="767171" w:sz="4"/>
-              <w:bottom w:val="single" w:color="767171" w:sz="4"/>
-              <w:right w:val="single" w:color="767171" w:sz="4"/>
+              <w:top w:val="single" w:color="000000" w:sz="4"/>
+              <w:left w:val="single" w:color="000000" w:sz="4"/>
+              <w:bottom w:val="single" w:color="000000" w:sz="4"/>
+              <w:right w:val="single" w:color="000000" w:sz="4"/>
             </w:tcBorders>
             <w:tcMar>
               <w:top w:type="dxa" w:w="80"/>
@@ -1656,7 +1656,7 @@
                 <w:bCs/>
                 <w:i w:val="false"/>
                 <w:iCs w:val="false"/>
-                <w:color w:val="1a1917"/>
+                <w:color w:val="1a1a1a"/>
                 <w:sz w:val="20"/>
                 <w:szCs w:val="20"/>
               </w:rPr>
@@ -1675,7 +1675,7 @@
                 <w:bCs w:val="false"/>
                 <w:i/>
                 <w:iCs/>
-                <w:color w:val="1a1917"/>
+                <w:color w:val="1a1a1a"/>
                 <w:sz w:val="20"/>
                 <w:szCs w:val="20"/>
               </w:rPr>
@@ -1687,10 +1687,10 @@
           <w:tcPr>
             <w:tcW w:type="dxa" w:w="3426"/>
             <w:tcBorders>
-              <w:top w:val="single" w:color="767171" w:sz="4"/>
-              <w:left w:val="single" w:color="767171" w:sz="4"/>
-              <w:bottom w:val="single" w:color="767171" w:sz="4"/>
-              <w:right w:val="single" w:color="767171" w:sz="4"/>
+              <w:top w:val="single" w:color="000000" w:sz="4"/>
+              <w:left w:val="single" w:color="000000" w:sz="4"/>
+              <w:bottom w:val="single" w:color="000000" w:sz="4"/>
+              <w:right w:val="single" w:color="000000" w:sz="4"/>
             </w:tcBorders>
             <w:tcMar>
               <w:top w:type="dxa" w:w="80"/>
@@ -1712,7 +1712,7 @@
                 <w:bCs w:val="false"/>
                 <w:i w:val="false"/>
                 <w:iCs w:val="false"/>
-                <w:color w:val="1a1917"/>
+                <w:color w:val="1a1a1a"/>
                 <w:sz w:val="20"/>
                 <w:szCs w:val="20"/>
               </w:rPr>
@@ -1731,7 +1731,7 @@
                 <w:bCs w:val="false"/>
                 <w:i/>
                 <w:iCs/>
-                <w:color w:val="1a1917"/>
+                <w:color w:val="1a1a1a"/>
                 <w:sz w:val="20"/>
                 <w:szCs w:val="20"/>
               </w:rPr>
@@ -1743,10 +1743,10 @@
           <w:tcPr>
             <w:tcW w:type="dxa" w:w="2513"/>
             <w:tcBorders>
-              <w:top w:val="single" w:color="767171" w:sz="4"/>
-              <w:left w:val="single" w:color="767171" w:sz="4"/>
-              <w:bottom w:val="single" w:color="767171" w:sz="4"/>
-              <w:right w:val="single" w:color="767171" w:sz="4"/>
+              <w:top w:val="single" w:color="000000" w:sz="4"/>
+              <w:left w:val="single" w:color="000000" w:sz="4"/>
+              <w:bottom w:val="single" w:color="000000" w:sz="4"/>
+              <w:right w:val="single" w:color="000000" w:sz="4"/>
             </w:tcBorders>
             <w:tcMar>
               <w:top w:type="dxa" w:w="80"/>
@@ -1768,7 +1768,7 @@
                 <w:bCs w:val="false"/>
                 <w:i w:val="false"/>
                 <w:iCs w:val="false"/>
-                <w:color w:val="1a1917"/>
+                <w:color w:val="1a1a1a"/>
                 <w:sz w:val="20"/>
                 <w:szCs w:val="20"/>
               </w:rPr>
@@ -1780,10 +1780,10 @@
           <w:tcPr>
             <w:tcW w:type="dxa" w:w="1458"/>
             <w:tcBorders>
-              <w:top w:val="single" w:color="767171" w:sz="4"/>
-              <w:left w:val="single" w:color="767171" w:sz="4"/>
-              <w:bottom w:val="single" w:color="767171" w:sz="4"/>
-              <w:right w:val="single" w:color="767171" w:sz="4"/>
+              <w:top w:val="single" w:color="000000" w:sz="4"/>
+              <w:left w:val="single" w:color="000000" w:sz="4"/>
+              <w:bottom w:val="single" w:color="000000" w:sz="4"/>
+              <w:right w:val="single" w:color="000000" w:sz="4"/>
             </w:tcBorders>
             <w:tcMar>
               <w:top w:type="dxa" w:w="80"/>
@@ -1805,7 +1805,7 @@
                 <w:bCs w:val="false"/>
                 <w:i w:val="false"/>
                 <w:iCs w:val="false"/>
-                <w:color w:val="1a1917"/>
+                <w:color w:val="1a1a1a"/>
                 <w:sz w:val="20"/>
                 <w:szCs w:val="20"/>
               </w:rPr>
@@ -1824,7 +1824,7 @@
                 <w:bCs w:val="false"/>
                 <w:i/>
                 <w:iCs/>
-                <w:color w:val="1a1917"/>
+                <w:color w:val="1a1a1a"/>
                 <w:sz w:val="20"/>
                 <w:szCs w:val="20"/>
               </w:rPr>
@@ -1838,10 +1838,10 @@
           <w:tcPr>
             <w:tcW w:type="dxa" w:w="1675"/>
             <w:tcBorders>
-              <w:top w:val="single" w:color="767171" w:sz="4"/>
-              <w:left w:val="single" w:color="767171" w:sz="4"/>
-              <w:bottom w:val="single" w:color="767171" w:sz="4"/>
-              <w:right w:val="single" w:color="767171" w:sz="4"/>
+              <w:top w:val="single" w:color="000000" w:sz="4"/>
+              <w:left w:val="single" w:color="000000" w:sz="4"/>
+              <w:bottom w:val="single" w:color="000000" w:sz="4"/>
+              <w:right w:val="single" w:color="000000" w:sz="4"/>
             </w:tcBorders>
             <w:tcMar>
               <w:top w:type="dxa" w:w="80"/>
@@ -1863,7 +1863,7 @@
                 <w:bCs w:val="false"/>
                 <w:i w:val="false"/>
                 <w:iCs w:val="false"/>
-                <w:color w:val="1a1917"/>
+                <w:color w:val="1a1a1a"/>
                 <w:sz w:val="16"/>
                 <w:szCs w:val="16"/>
               </w:rPr>
@@ -1875,10 +1875,10 @@
           <w:tcPr>
             <w:tcW w:type="dxa" w:w="3426"/>
             <w:tcBorders>
-              <w:top w:val="single" w:color="767171" w:sz="4"/>
-              <w:left w:val="single" w:color="767171" w:sz="4"/>
-              <w:bottom w:val="single" w:color="767171" w:sz="4"/>
-              <w:right w:val="single" w:color="767171" w:sz="4"/>
+              <w:top w:val="single" w:color="000000" w:sz="4"/>
+              <w:left w:val="single" w:color="000000" w:sz="4"/>
+              <w:bottom w:val="single" w:color="000000" w:sz="4"/>
+              <w:right w:val="single" w:color="000000" w:sz="4"/>
             </w:tcBorders>
             <w:tcMar>
               <w:top w:type="dxa" w:w="80"/>
@@ -1900,7 +1900,7 @@
                 <w:bCs w:val="false"/>
                 <w:i w:val="false"/>
                 <w:iCs w:val="false"/>
-                <w:color w:val="1a1917"/>
+                <w:color w:val="1a1a1a"/>
                 <w:sz w:val="16"/>
                 <w:szCs w:val="16"/>
               </w:rPr>
@@ -1912,10 +1912,10 @@
           <w:tcPr>
             <w:tcW w:type="dxa" w:w="2513"/>
             <w:tcBorders>
-              <w:top w:val="single" w:color="767171" w:sz="4"/>
-              <w:left w:val="single" w:color="767171" w:sz="4"/>
-              <w:bottom w:val="single" w:color="767171" w:sz="4"/>
-              <w:right w:val="single" w:color="767171" w:sz="4"/>
+              <w:top w:val="single" w:color="000000" w:sz="4"/>
+              <w:left w:val="single" w:color="000000" w:sz="4"/>
+              <w:bottom w:val="single" w:color="000000" w:sz="4"/>
+              <w:right w:val="single" w:color="000000" w:sz="4"/>
             </w:tcBorders>
             <w:tcMar>
               <w:top w:type="dxa" w:w="80"/>
@@ -1937,7 +1937,7 @@
                 <w:bCs w:val="false"/>
                 <w:i w:val="false"/>
                 <w:iCs w:val="false"/>
-                <w:color w:val="1a1917"/>
+                <w:color w:val="1a1a1a"/>
                 <w:sz w:val="16"/>
                 <w:szCs w:val="16"/>
               </w:rPr>
@@ -1949,10 +1949,10 @@
           <w:tcPr>
             <w:tcW w:type="dxa" w:w="1458"/>
             <w:tcBorders>
-              <w:top w:val="single" w:color="767171" w:sz="4"/>
-              <w:left w:val="single" w:color="767171" w:sz="4"/>
-              <w:bottom w:val="single" w:color="767171" w:sz="4"/>
-              <w:right w:val="single" w:color="767171" w:sz="4"/>
+              <w:top w:val="single" w:color="000000" w:sz="4"/>
+              <w:left w:val="single" w:color="000000" w:sz="4"/>
+              <w:bottom w:val="single" w:color="000000" w:sz="4"/>
+              <w:right w:val="single" w:color="000000" w:sz="4"/>
             </w:tcBorders>
             <w:tcMar>
               <w:top w:type="dxa" w:w="80"/>
@@ -1974,11 +1974,150 @@
                 <w:bCs w:val="false"/>
                 <w:i w:val="false"/>
                 <w:iCs w:val="false"/>
-                <w:color w:val="1a1917"/>
+                <w:color w:val="1a1a1a"/>
                 <w:sz w:val="20"/>
                 <w:szCs w:val="20"/>
               </w:rPr>
               <w:t xml:space="preserve">[63 ± 5] %RH</w:t>
+            </w:r>
+          </w:p>
+        </w:tc>
+      </w:tr>
+    </w:tbl>
+    <w:p>
+      <w:pPr>
+        <w:spacing w:before="200"/>
+        <w:jc w:val="left"/>
+      </w:pPr>
+      <w:r>
+        <w:rPr>
+          <w:rFonts w:ascii="Arial" w:cs="Arial" w:eastAsia="Arial" w:hAnsi="Arial"/>
+          <w:b w:val="false"/>
+          <w:bCs w:val="false"/>
+          <w:i w:val="false"/>
+          <w:iCs w:val="false"/>
+          <w:color w:val="1a1a1a"/>
+          <w:sz w:val="20"/>
+          <w:szCs w:val="20"/>
+        </w:rPr>
+        <w:t xml:space="preserve"/>
+      </w:r>
+    </w:p>
+    <w:tbl>
+      <w:tblPr>
+        <w:tblW w:type="dxa" w:w="9072"/>
+        <w:jc w:val="center"/>
+        <w:tblBorders>
+          <w:top w:val="single" w:color="auto" w:sz="4"/>
+          <w:left w:val="single" w:color="auto" w:sz="4"/>
+          <w:bottom w:val="single" w:color="auto" w:sz="4"/>
+          <w:right w:val="single" w:color="auto" w:sz="4"/>
+          <w:insideH w:val="single" w:color="auto" w:sz="4"/>
+          <w:insideV w:val="single" w:color="auto" w:sz="4"/>
+        </w:tblBorders>
+      </w:tblPr>
+      <w:tblGrid>
+        <w:gridCol w:w="100"/>
+        <w:gridCol w:w="100"/>
+      </w:tblGrid>
+      <w:tr>
+        <w:tc>
+          <w:tcPr>
+            <w:tcW w:type="dxa" w:w="4536"/>
+            <w:tcBorders>
+              <w:top w:val="none" w:color="auto" w:sz="0"/>
+              <w:left w:val="none" w:color="auto" w:sz="0"/>
+              <w:bottom w:val="none" w:color="auto" w:sz="0"/>
+              <w:right w:val="none" w:color="auto" w:sz="0"/>
+            </w:tcBorders>
+            <w:vAlign w:val="center"/>
+          </w:tcPr>
+          <w:p>
+            <w:pPr>
+              <w:spacing w:after="0" w:before="60"/>
+              <w:jc w:val="center"/>
+            </w:pPr>
+            <w:r>
+              <w:rPr>
+                <w:rFonts w:ascii="Arial" w:cs="Arial" w:eastAsia="Arial" w:hAnsi="Arial"/>
+                <w:b/>
+                <w:bCs/>
+                <w:i w:val="false"/>
+                <w:iCs w:val="false"/>
+                <w:color w:val="1a1a1a"/>
+                <w:sz w:val="20"/>
+                <w:szCs w:val="20"/>
+              </w:rPr>
+              <w:t xml:space="preserve">PHỤ TRÁCH PHÒNG HIỆU CHUẨN</w:t>
+            </w:r>
+          </w:p>
+          <w:p>
+            <w:pPr>
+              <w:spacing w:after="40" w:before="0"/>
+              <w:jc w:val="center"/>
+            </w:pPr>
+            <w:r>
+              <w:rPr>
+                <w:rFonts w:ascii="Arial" w:cs="Arial" w:eastAsia="Arial" w:hAnsi="Arial"/>
+                <w:b w:val="false"/>
+                <w:bCs w:val="false"/>
+                <w:i/>
+                <w:iCs/>
+                <w:color w:val="1a1a1a"/>
+                <w:sz w:val="20"/>
+                <w:szCs w:val="20"/>
+              </w:rPr>
+              <w:t xml:space="preserve">HEAD OF CALIBRATION LAB.</w:t>
+            </w:r>
+          </w:p>
+        </w:tc>
+        <w:tc>
+          <w:tcPr>
+            <w:tcW w:type="dxa" w:w="4536"/>
+            <w:tcBorders>
+              <w:top w:val="none" w:color="auto" w:sz="0"/>
+              <w:left w:val="none" w:color="auto" w:sz="0"/>
+              <w:bottom w:val="none" w:color="auto" w:sz="0"/>
+              <w:right w:val="none" w:color="auto" w:sz="0"/>
+            </w:tcBorders>
+            <w:vAlign w:val="center"/>
+          </w:tcPr>
+          <w:p>
+            <w:pPr>
+              <w:spacing w:after="0" w:before="60"/>
+              <w:jc w:val="center"/>
+            </w:pPr>
+            <w:r>
+              <w:rPr>
+                <w:rFonts w:ascii="Arial" w:cs="Arial" w:eastAsia="Arial" w:hAnsi="Arial"/>
+                <w:b/>
+                <w:bCs/>
+                <w:i w:val="false"/>
+                <w:iCs w:val="false"/>
+                <w:color w:val="1a1a1a"/>
+                <w:sz w:val="20"/>
+                <w:szCs w:val="20"/>
+              </w:rPr>
+              <w:t xml:space="preserve">GIÁM ĐỐC</w:t>
+            </w:r>
+          </w:p>
+          <w:p>
+            <w:pPr>
+              <w:spacing w:after="40" w:before="0"/>
+              <w:jc w:val="center"/>
+            </w:pPr>
+            <w:r>
+              <w:rPr>
+                <w:rFonts w:ascii="Arial" w:cs="Arial" w:eastAsia="Arial" w:hAnsi="Arial"/>
+                <w:b w:val="false"/>
+                <w:bCs w:val="false"/>
+                <w:i/>
+                <w:iCs/>
+                <w:color w:val="1a1a1a"/>
+                <w:sz w:val="20"/>
+                <w:szCs w:val="20"/>
+              </w:rPr>
+              <w:t xml:space="preserve">DIRECTOR</w:t>
             </w:r>
           </w:p>
         </w:tc>
@@ -1986,149 +2125,55 @@
       <w:tr>
         <w:tc>
           <w:tcPr>
-            <w:tcW w:type="dxa" w:w="1675"/>
-            <w:tcBorders>
-              <w:top w:val="single" w:color="767171" w:sz="4"/>
-              <w:left w:val="single" w:color="767171" w:sz="4"/>
-              <w:bottom w:val="single" w:color="767171" w:sz="4"/>
-              <w:right w:val="single" w:color="767171" w:sz="4"/>
-            </w:tcBorders>
-            <w:tcMar>
-              <w:top w:type="dxa" w:w="80"/>
-              <w:left w:type="dxa" w:w="100"/>
-              <w:bottom w:type="dxa" w:w="80"/>
-              <w:right w:type="dxa" w:w="150"/>
-            </w:tcMar>
-            <w:vAlign w:val="center"/>
-          </w:tcPr>
-          <w:p>
-            <w:pPr>
-              <w:spacing w:after="20" w:before="20"/>
-              <w:jc w:val="left"/>
-            </w:pPr>
-            <w:r>
-              <w:rPr>
-                <w:rFonts w:ascii="Arial" w:cs="Arial" w:eastAsia="Arial" w:hAnsi="Arial"/>
-                <w:b w:val="false"/>
-                <w:bCs w:val="false"/>
-                <w:i w:val="false"/>
-                <w:iCs w:val="false"/>
-                <w:color w:val="1a1917"/>
+            <w:tcW w:type="dxa" w:w="4536"/>
+            <w:tcBorders>
+              <w:top w:val="none" w:color="auto" w:sz="0"/>
+              <w:left w:val="none" w:color="auto" w:sz="0"/>
+              <w:bottom w:val="none" w:color="auto" w:sz="0"/>
+              <w:right w:val="none" w:color="auto" w:sz="0"/>
+            </w:tcBorders>
+            <w:vAlign w:val="center"/>
+          </w:tcPr>
+          <w:p>
+            <w:pPr>
+              <w:spacing w:before="300"/>
+              <w:jc w:val="center"/>
+            </w:pPr>
+            <w:r>
+              <w:rPr>
+                <w:rFonts w:ascii="Arial" w:cs="Arial" w:eastAsia="Arial" w:hAnsi="Arial"/>
+                <w:color w:val="555555"/>
                 <w:sz w:val="16"/>
                 <w:szCs w:val="16"/>
               </w:rPr>
-              <w:t xml:space="preserve"/>
-            </w:r>
-          </w:p>
-        </w:tc>
-        <w:tc>
-          <w:tcPr>
-            <w:tcW w:type="dxa" w:w="3426"/>
-            <w:tcBorders>
-              <w:top w:val="single" w:color="767171" w:sz="4"/>
-              <w:left w:val="single" w:color="767171" w:sz="4"/>
-              <w:bottom w:val="single" w:color="767171" w:sz="4"/>
-              <w:right w:val="single" w:color="767171" w:sz="4"/>
-            </w:tcBorders>
-            <w:tcMar>
-              <w:top w:type="dxa" w:w="80"/>
-              <w:left w:type="dxa" w:w="100"/>
-              <w:bottom w:type="dxa" w:w="80"/>
-              <w:right w:type="dxa" w:w="150"/>
-            </w:tcMar>
-            <w:vAlign w:val="center"/>
-          </w:tcPr>
-          <w:p>
-            <w:pPr>
-              <w:spacing w:after="20" w:before="20"/>
-              <w:jc w:val="left"/>
-            </w:pPr>
-            <w:r>
-              <w:rPr>
-                <w:rFonts w:ascii="Arial" w:cs="Arial" w:eastAsia="Arial" w:hAnsi="Arial"/>
-                <w:b w:val="false"/>
-                <w:bCs w:val="false"/>
-                <w:i w:val="false"/>
-                <w:iCs w:val="false"/>
-                <w:color w:val="1a1917"/>
+              <w:t xml:space="preserve">________________________________________</w:t>
+            </w:r>
+          </w:p>
+        </w:tc>
+        <w:tc>
+          <w:tcPr>
+            <w:tcW w:type="dxa" w:w="4536"/>
+            <w:tcBorders>
+              <w:top w:val="none" w:color="auto" w:sz="0"/>
+              <w:left w:val="none" w:color="auto" w:sz="0"/>
+              <w:bottom w:val="none" w:color="auto" w:sz="0"/>
+              <w:right w:val="none" w:color="auto" w:sz="0"/>
+            </w:tcBorders>
+            <w:vAlign w:val="center"/>
+          </w:tcPr>
+          <w:p>
+            <w:pPr>
+              <w:spacing w:before="300"/>
+              <w:jc w:val="center"/>
+            </w:pPr>
+            <w:r>
+              <w:rPr>
+                <w:rFonts w:ascii="Arial" w:cs="Arial" w:eastAsia="Arial" w:hAnsi="Arial"/>
+                <w:color w:val="555555"/>
                 <w:sz w:val="16"/>
                 <w:szCs w:val="16"/>
               </w:rPr>
-              <w:t xml:space="preserve"/>
-            </w:r>
-          </w:p>
-        </w:tc>
-        <w:tc>
-          <w:tcPr>
-            <w:tcW w:type="dxa" w:w="2513"/>
-            <w:tcBorders>
-              <w:top w:val="single" w:color="767171" w:sz="4"/>
-              <w:left w:val="single" w:color="767171" w:sz="4"/>
-              <w:bottom w:val="single" w:color="767171" w:sz="4"/>
-              <w:right w:val="single" w:color="767171" w:sz="4"/>
-            </w:tcBorders>
-            <w:tcMar>
-              <w:top w:type="dxa" w:w="80"/>
-              <w:left w:type="dxa" w:w="100"/>
-              <w:bottom w:type="dxa" w:w="80"/>
-              <w:right w:type="dxa" w:w="150"/>
-            </w:tcMar>
-            <w:vAlign w:val="center"/>
-          </w:tcPr>
-          <w:p>
-            <w:pPr>
-              <w:spacing w:after="20" w:before="20"/>
-              <w:jc w:val="left"/>
-            </w:pPr>
-            <w:r>
-              <w:rPr>
-                <w:rFonts w:ascii="Arial" w:cs="Arial" w:eastAsia="Arial" w:hAnsi="Arial"/>
-                <w:b w:val="false"/>
-                <w:bCs w:val="false"/>
-                <w:i w:val="false"/>
-                <w:iCs w:val="false"/>
-                <w:color w:val="1a1917"/>
-                <w:sz w:val="16"/>
-                <w:szCs w:val="16"/>
-              </w:rPr>
-              <w:t xml:space="preserve"/>
-            </w:r>
-          </w:p>
-        </w:tc>
-        <w:tc>
-          <w:tcPr>
-            <w:tcW w:type="dxa" w:w="1458"/>
-            <w:tcBorders>
-              <w:top w:val="single" w:color="767171" w:sz="4"/>
-              <w:left w:val="single" w:color="767171" w:sz="4"/>
-              <w:bottom w:val="single" w:color="767171" w:sz="4"/>
-              <w:right w:val="single" w:color="767171" w:sz="4"/>
-            </w:tcBorders>
-            <w:tcMar>
-              <w:top w:type="dxa" w:w="80"/>
-              <w:left w:type="dxa" w:w="100"/>
-              <w:bottom w:type="dxa" w:w="80"/>
-              <w:right w:type="dxa" w:w="150"/>
-            </w:tcMar>
-            <w:vAlign w:val="center"/>
-          </w:tcPr>
-          <w:p>
-            <w:pPr>
-              <w:spacing w:after="20" w:before="20"/>
-              <w:jc w:val="left"/>
-            </w:pPr>
-            <w:r>
-              <w:rPr>
-                <w:rFonts w:ascii="Arial" w:cs="Arial" w:eastAsia="Arial" w:hAnsi="Arial"/>
-                <w:b w:val="false"/>
-                <w:bCs w:val="false"/>
-                <w:i w:val="false"/>
-                <w:iCs w:val="false"/>
-                <w:color w:val="1a1917"/>
-                <w:sz w:val="16"/>
-                <w:szCs w:val="16"/>
-              </w:rPr>
-              <w:t xml:space="preserve"/>
+              <w:t xml:space="preserve">________________________________________</w:t>
             </w:r>
           </w:p>
         </w:tc>
@@ -2136,475 +2181,18 @@
       <w:tr>
         <w:tc>
           <w:tcPr>
-            <w:tcW w:type="dxa" w:w="1675"/>
-            <w:tcBorders>
-              <w:top w:val="single" w:color="767171" w:sz="4"/>
-              <w:left w:val="single" w:color="767171" w:sz="4"/>
-              <w:bottom w:val="single" w:color="767171" w:sz="4"/>
-              <w:right w:val="single" w:color="767171" w:sz="4"/>
-            </w:tcBorders>
-            <w:tcMar>
-              <w:top w:type="dxa" w:w="80"/>
-              <w:left w:type="dxa" w:w="100"/>
-              <w:bottom w:type="dxa" w:w="80"/>
-              <w:right w:type="dxa" w:w="150"/>
-            </w:tcMar>
-            <w:vAlign w:val="center"/>
-          </w:tcPr>
-          <w:p>
-            <w:pPr>
-              <w:spacing w:after="20" w:before="20"/>
-              <w:jc w:val="left"/>
-            </w:pPr>
-            <w:r>
-              <w:rPr>
-                <w:rFonts w:ascii="Arial" w:cs="Arial" w:eastAsia="Arial" w:hAnsi="Arial"/>
-                <w:b w:val="false"/>
-                <w:bCs w:val="false"/>
-                <w:i w:val="false"/>
-                <w:iCs w:val="false"/>
-                <w:color w:val="1a1917"/>
-                <w:sz w:val="16"/>
-                <w:szCs w:val="16"/>
-              </w:rPr>
-              <w:t xml:space="preserve"/>
-            </w:r>
-          </w:p>
-        </w:tc>
-        <w:tc>
-          <w:tcPr>
-            <w:tcW w:type="dxa" w:w="3426"/>
-            <w:tcBorders>
-              <w:top w:val="single" w:color="767171" w:sz="4"/>
-              <w:left w:val="single" w:color="767171" w:sz="4"/>
-              <w:bottom w:val="single" w:color="767171" w:sz="4"/>
-              <w:right w:val="single" w:color="767171" w:sz="4"/>
-            </w:tcBorders>
-            <w:tcMar>
-              <w:top w:type="dxa" w:w="80"/>
-              <w:left w:type="dxa" w:w="100"/>
-              <w:bottom w:type="dxa" w:w="80"/>
-              <w:right w:type="dxa" w:w="150"/>
-            </w:tcMar>
-            <w:vAlign w:val="center"/>
-          </w:tcPr>
-          <w:p>
-            <w:pPr>
-              <w:spacing w:after="20" w:before="20"/>
-              <w:jc w:val="left"/>
-            </w:pPr>
-            <w:r>
-              <w:rPr>
-                <w:rFonts w:ascii="Arial" w:cs="Arial" w:eastAsia="Arial" w:hAnsi="Arial"/>
-                <w:b w:val="false"/>
-                <w:bCs w:val="false"/>
-                <w:i w:val="false"/>
-                <w:iCs w:val="false"/>
-                <w:color w:val="1a1917"/>
-                <w:sz w:val="16"/>
-                <w:szCs w:val="16"/>
-              </w:rPr>
-              <w:t xml:space="preserve"/>
-            </w:r>
-          </w:p>
-        </w:tc>
-        <w:tc>
-          <w:tcPr>
-            <w:tcW w:type="dxa" w:w="2513"/>
-            <w:tcBorders>
-              <w:top w:val="single" w:color="767171" w:sz="4"/>
-              <w:left w:val="single" w:color="767171" w:sz="4"/>
-              <w:bottom w:val="single" w:color="767171" w:sz="4"/>
-              <w:right w:val="single" w:color="767171" w:sz="4"/>
-            </w:tcBorders>
-            <w:tcMar>
-              <w:top w:type="dxa" w:w="80"/>
-              <w:left w:type="dxa" w:w="100"/>
-              <w:bottom w:type="dxa" w:w="80"/>
-              <w:right w:type="dxa" w:w="150"/>
-            </w:tcMar>
-            <w:vAlign w:val="center"/>
-          </w:tcPr>
-          <w:p>
-            <w:pPr>
-              <w:spacing w:after="20" w:before="20"/>
-              <w:jc w:val="left"/>
-            </w:pPr>
-            <w:r>
-              <w:rPr>
-                <w:rFonts w:ascii="Arial" w:cs="Arial" w:eastAsia="Arial" w:hAnsi="Arial"/>
-                <w:b w:val="false"/>
-                <w:bCs w:val="false"/>
-                <w:i w:val="false"/>
-                <w:iCs w:val="false"/>
-                <w:color w:val="1a1917"/>
-                <w:sz w:val="16"/>
-                <w:szCs w:val="16"/>
-              </w:rPr>
-              <w:t xml:space="preserve"/>
-            </w:r>
-          </w:p>
-        </w:tc>
-        <w:tc>
-          <w:tcPr>
-            <w:tcW w:type="dxa" w:w="1458"/>
-            <w:tcBorders>
-              <w:top w:val="single" w:color="767171" w:sz="4"/>
-              <w:left w:val="single" w:color="767171" w:sz="4"/>
-              <w:bottom w:val="single" w:color="767171" w:sz="4"/>
-              <w:right w:val="single" w:color="767171" w:sz="4"/>
-            </w:tcBorders>
-            <w:tcMar>
-              <w:top w:type="dxa" w:w="80"/>
-              <w:left w:type="dxa" w:w="100"/>
-              <w:bottom w:type="dxa" w:w="80"/>
-              <w:right w:type="dxa" w:w="150"/>
-            </w:tcMar>
-            <w:vAlign w:val="center"/>
-          </w:tcPr>
-          <w:p>
-            <w:pPr>
-              <w:spacing w:after="20" w:before="20"/>
-              <w:jc w:val="left"/>
-            </w:pPr>
-            <w:r>
-              <w:rPr>
-                <w:rFonts w:ascii="Arial" w:cs="Arial" w:eastAsia="Arial" w:hAnsi="Arial"/>
-                <w:b w:val="false"/>
-                <w:bCs w:val="false"/>
-                <w:i w:val="false"/>
-                <w:iCs w:val="false"/>
-                <w:color w:val="1a1917"/>
-                <w:sz w:val="16"/>
-                <w:szCs w:val="16"/>
-              </w:rPr>
-              <w:t xml:space="preserve"/>
-            </w:r>
-          </w:p>
-        </w:tc>
-      </w:tr>
-      <w:tr>
-        <w:tc>
-          <w:tcPr>
-            <w:tcW w:type="dxa" w:w="1675"/>
-            <w:tcBorders>
-              <w:top w:val="single" w:color="767171" w:sz="4"/>
-              <w:left w:val="single" w:color="767171" w:sz="4"/>
-              <w:bottom w:val="single" w:color="767171" w:sz="4"/>
-              <w:right w:val="single" w:color="767171" w:sz="4"/>
-            </w:tcBorders>
-            <w:tcMar>
-              <w:top w:type="dxa" w:w="80"/>
-              <w:left w:type="dxa" w:w="100"/>
-              <w:bottom w:type="dxa" w:w="80"/>
-              <w:right w:type="dxa" w:w="150"/>
-            </w:tcMar>
-            <w:vAlign w:val="center"/>
-          </w:tcPr>
-          <w:p>
-            <w:pPr>
-              <w:spacing w:after="20" w:before="20"/>
-              <w:jc w:val="left"/>
-            </w:pPr>
-            <w:r>
-              <w:rPr>
-                <w:rFonts w:ascii="Arial" w:cs="Arial" w:eastAsia="Arial" w:hAnsi="Arial"/>
-                <w:b w:val="false"/>
-                <w:bCs w:val="false"/>
-                <w:i w:val="false"/>
-                <w:iCs w:val="false"/>
-                <w:color w:val="1a1917"/>
-                <w:sz w:val="16"/>
-                <w:szCs w:val="16"/>
-              </w:rPr>
-              <w:t xml:space="preserve"/>
-            </w:r>
-          </w:p>
-        </w:tc>
-        <w:tc>
-          <w:tcPr>
-            <w:tcW w:type="dxa" w:w="3426"/>
-            <w:tcBorders>
-              <w:top w:val="single" w:color="767171" w:sz="4"/>
-              <w:left w:val="single" w:color="767171" w:sz="4"/>
-              <w:bottom w:val="single" w:color="767171" w:sz="4"/>
-              <w:right w:val="single" w:color="767171" w:sz="4"/>
-            </w:tcBorders>
-            <w:tcMar>
-              <w:top w:type="dxa" w:w="80"/>
-              <w:left w:type="dxa" w:w="100"/>
-              <w:bottom w:type="dxa" w:w="80"/>
-              <w:right w:type="dxa" w:w="150"/>
-            </w:tcMar>
-            <w:vAlign w:val="center"/>
-          </w:tcPr>
-          <w:p>
-            <w:pPr>
-              <w:spacing w:after="20" w:before="20"/>
-              <w:jc w:val="left"/>
-            </w:pPr>
-            <w:r>
-              <w:rPr>
-                <w:rFonts w:ascii="Arial" w:cs="Arial" w:eastAsia="Arial" w:hAnsi="Arial"/>
-                <w:b w:val="false"/>
-                <w:bCs w:val="false"/>
-                <w:i w:val="false"/>
-                <w:iCs w:val="false"/>
-                <w:color w:val="1a1917"/>
-                <w:sz w:val="16"/>
-                <w:szCs w:val="16"/>
-              </w:rPr>
-              <w:t xml:space="preserve"/>
-            </w:r>
-          </w:p>
-        </w:tc>
-        <w:tc>
-          <w:tcPr>
-            <w:tcW w:type="dxa" w:w="2513"/>
-            <w:tcBorders>
-              <w:top w:val="single" w:color="767171" w:sz="4"/>
-              <w:left w:val="single" w:color="767171" w:sz="4"/>
-              <w:bottom w:val="single" w:color="767171" w:sz="4"/>
-              <w:right w:val="single" w:color="767171" w:sz="4"/>
-            </w:tcBorders>
-            <w:tcMar>
-              <w:top w:type="dxa" w:w="80"/>
-              <w:left w:type="dxa" w:w="100"/>
-              <w:bottom w:type="dxa" w:w="80"/>
-              <w:right w:type="dxa" w:w="150"/>
-            </w:tcMar>
-            <w:vAlign w:val="center"/>
-          </w:tcPr>
-          <w:p>
-            <w:pPr>
-              <w:spacing w:after="20" w:before="20"/>
-              <w:jc w:val="left"/>
-            </w:pPr>
-            <w:r>
-              <w:rPr>
-                <w:rFonts w:ascii="Arial" w:cs="Arial" w:eastAsia="Arial" w:hAnsi="Arial"/>
-                <w:b w:val="false"/>
-                <w:bCs w:val="false"/>
-                <w:i w:val="false"/>
-                <w:iCs w:val="false"/>
-                <w:color w:val="1a1917"/>
-                <w:sz w:val="16"/>
-                <w:szCs w:val="16"/>
-              </w:rPr>
-              <w:t xml:space="preserve"/>
-            </w:r>
-          </w:p>
-        </w:tc>
-        <w:tc>
-          <w:tcPr>
-            <w:tcW w:type="dxa" w:w="1458"/>
-            <w:tcBorders>
-              <w:top w:val="single" w:color="767171" w:sz="4"/>
-              <w:left w:val="single" w:color="767171" w:sz="4"/>
-              <w:bottom w:val="single" w:color="767171" w:sz="4"/>
-              <w:right w:val="single" w:color="767171" w:sz="4"/>
-            </w:tcBorders>
-            <w:tcMar>
-              <w:top w:type="dxa" w:w="80"/>
-              <w:left w:type="dxa" w:w="100"/>
-              <w:bottom w:type="dxa" w:w="80"/>
-              <w:right w:type="dxa" w:w="150"/>
-            </w:tcMar>
-            <w:vAlign w:val="center"/>
-          </w:tcPr>
-          <w:p>
-            <w:pPr>
-              <w:spacing w:after="20" w:before="20"/>
-              <w:jc w:val="left"/>
-            </w:pPr>
-            <w:r>
-              <w:rPr>
-                <w:rFonts w:ascii="Arial" w:cs="Arial" w:eastAsia="Arial" w:hAnsi="Arial"/>
-                <w:b w:val="false"/>
-                <w:bCs w:val="false"/>
-                <w:i w:val="false"/>
-                <w:iCs w:val="false"/>
-                <w:color w:val="1a1917"/>
-                <w:sz w:val="16"/>
-                <w:szCs w:val="16"/>
-              </w:rPr>
-              <w:t xml:space="preserve"/>
-            </w:r>
-          </w:p>
-        </w:tc>
-      </w:tr>
-      <w:tr>
-        <w:tc>
-          <w:tcPr>
-            <w:tcW w:type="dxa" w:w="1675"/>
-            <w:tcBorders>
-              <w:top w:val="single" w:color="767171" w:sz="4"/>
-              <w:left w:val="single" w:color="767171" w:sz="4"/>
-              <w:bottom w:val="single" w:color="767171" w:sz="4"/>
-              <w:right w:val="single" w:color="767171" w:sz="4"/>
-            </w:tcBorders>
-            <w:tcMar>
-              <w:top w:type="dxa" w:w="80"/>
-              <w:left w:type="dxa" w:w="100"/>
-              <w:bottom w:type="dxa" w:w="80"/>
-              <w:right w:type="dxa" w:w="150"/>
-            </w:tcMar>
-            <w:vAlign w:val="center"/>
-          </w:tcPr>
-          <w:p>
-            <w:pPr>
-              <w:spacing w:after="20" w:before="20"/>
-              <w:jc w:val="left"/>
-            </w:pPr>
-            <w:r>
-              <w:rPr>
-                <w:rFonts w:ascii="Arial" w:cs="Arial" w:eastAsia="Arial" w:hAnsi="Arial"/>
-                <w:b w:val="false"/>
-                <w:bCs w:val="false"/>
-                <w:i w:val="false"/>
-                <w:iCs w:val="false"/>
-                <w:color w:val="1a1917"/>
-                <w:sz w:val="16"/>
-                <w:szCs w:val="16"/>
-              </w:rPr>
-              <w:t xml:space="preserve"/>
-            </w:r>
-          </w:p>
-        </w:tc>
-        <w:tc>
-          <w:tcPr>
-            <w:tcW w:type="dxa" w:w="3426"/>
-            <w:tcBorders>
-              <w:top w:val="single" w:color="767171" w:sz="4"/>
-              <w:left w:val="single" w:color="767171" w:sz="4"/>
-              <w:bottom w:val="single" w:color="767171" w:sz="4"/>
-              <w:right w:val="single" w:color="767171" w:sz="4"/>
-            </w:tcBorders>
-            <w:tcMar>
-              <w:top w:type="dxa" w:w="80"/>
-              <w:left w:type="dxa" w:w="100"/>
-              <w:bottom w:type="dxa" w:w="80"/>
-              <w:right w:type="dxa" w:w="150"/>
-            </w:tcMar>
-            <w:vAlign w:val="center"/>
-          </w:tcPr>
-          <w:p>
-            <w:pPr>
-              <w:spacing w:after="20" w:before="20"/>
-              <w:jc w:val="left"/>
-            </w:pPr>
-            <w:r>
-              <w:rPr>
-                <w:rFonts w:ascii="Arial" w:cs="Arial" w:eastAsia="Arial" w:hAnsi="Arial"/>
-                <w:b w:val="false"/>
-                <w:bCs w:val="false"/>
-                <w:i w:val="false"/>
-                <w:iCs w:val="false"/>
-                <w:color w:val="1a1917"/>
-                <w:sz w:val="16"/>
-                <w:szCs w:val="16"/>
-              </w:rPr>
-              <w:t xml:space="preserve"/>
-            </w:r>
-          </w:p>
-        </w:tc>
-        <w:tc>
-          <w:tcPr>
-            <w:tcW w:type="dxa" w:w="2513"/>
-            <w:tcBorders>
-              <w:top w:val="single" w:color="767171" w:sz="4"/>
-              <w:left w:val="single" w:color="767171" w:sz="4"/>
-              <w:bottom w:val="single" w:color="767171" w:sz="4"/>
-              <w:right w:val="single" w:color="767171" w:sz="4"/>
-            </w:tcBorders>
-            <w:tcMar>
-              <w:top w:type="dxa" w:w="80"/>
-              <w:left w:type="dxa" w:w="100"/>
-              <w:bottom w:type="dxa" w:w="80"/>
-              <w:right w:type="dxa" w:w="150"/>
-            </w:tcMar>
-            <w:vAlign w:val="center"/>
-          </w:tcPr>
-          <w:p>
-            <w:pPr>
-              <w:spacing w:after="20" w:before="20"/>
-              <w:jc w:val="left"/>
-            </w:pPr>
-            <w:r>
-              <w:rPr>
-                <w:rFonts w:ascii="Arial" w:cs="Arial" w:eastAsia="Arial" w:hAnsi="Arial"/>
-                <w:b w:val="false"/>
-                <w:bCs w:val="false"/>
-                <w:i w:val="false"/>
-                <w:iCs w:val="false"/>
-                <w:color w:val="1a1917"/>
-                <w:sz w:val="16"/>
-                <w:szCs w:val="16"/>
-              </w:rPr>
-              <w:t xml:space="preserve"/>
-            </w:r>
-          </w:p>
-        </w:tc>
-        <w:tc>
-          <w:tcPr>
-            <w:tcW w:type="dxa" w:w="1458"/>
-            <w:tcBorders>
-              <w:top w:val="single" w:color="767171" w:sz="4"/>
-              <w:left w:val="single" w:color="767171" w:sz="4"/>
-              <w:bottom w:val="single" w:color="767171" w:sz="4"/>
-              <w:right w:val="single" w:color="767171" w:sz="4"/>
-            </w:tcBorders>
-            <w:tcMar>
-              <w:top w:type="dxa" w:w="80"/>
-              <w:left w:type="dxa" w:w="100"/>
-              <w:bottom w:type="dxa" w:w="80"/>
-              <w:right w:type="dxa" w:w="150"/>
-            </w:tcMar>
-            <w:vAlign w:val="center"/>
-          </w:tcPr>
-          <w:p>
-            <w:pPr>
-              <w:spacing w:after="20" w:before="20"/>
-              <w:jc w:val="left"/>
-            </w:pPr>
-            <w:r>
-              <w:rPr>
-                <w:rFonts w:ascii="Arial" w:cs="Arial" w:eastAsia="Arial" w:hAnsi="Arial"/>
-                <w:b w:val="false"/>
-                <w:bCs w:val="false"/>
-                <w:i w:val="false"/>
-                <w:iCs w:val="false"/>
-                <w:color w:val="1a1917"/>
-                <w:sz w:val="16"/>
-                <w:szCs w:val="16"/>
-              </w:rPr>
-              <w:t xml:space="preserve"/>
-            </w:r>
-          </w:p>
-        </w:tc>
-      </w:tr>
-      <w:tr>
-        <w:tc>
-          <w:tcPr>
-            <w:tcW w:type="dxa" w:w="7614"/>
-            <w:gridSpan w:val="3"/>
-            <w:tcBorders>
-              <w:top w:val="single" w:color="767171" w:sz="4"/>
-              <w:left w:val="single" w:color="767171" w:sz="4"/>
-              <w:bottom w:val="single" w:color="767171" w:sz="4"/>
-              <w:right w:val="single" w:color="767171" w:sz="4"/>
-            </w:tcBorders>
-            <w:tcMar>
-              <w:top w:type="dxa" w:w="80"/>
-              <w:left w:type="dxa" w:w="100"/>
-              <w:bottom w:type="dxa" w:w="80"/>
-              <w:right w:type="dxa" w:w="150"/>
-            </w:tcMar>
-            <w:vAlign w:val="center"/>
-          </w:tcPr>
-          <w:p>
-            <w:pPr>
-              <w:spacing w:after="0" w:before="60"/>
+            <w:tcW w:type="dxa" w:w="4536"/>
+            <w:tcBorders>
+              <w:top w:val="none" w:color="auto" w:sz="0"/>
+              <w:left w:val="none" w:color="auto" w:sz="0"/>
+              <w:bottom w:val="none" w:color="auto" w:sz="0"/>
+              <w:right w:val="none" w:color="auto" w:sz="0"/>
+            </w:tcBorders>
+            <w:vAlign w:val="center"/>
+          </w:tcPr>
+          <w:p>
+            <w:pPr>
+              <w:spacing w:after="40" w:before="60"/>
               <w:jc w:val="center"/>
             </w:pPr>
             <w:r>
@@ -2614,53 +2202,28 @@
                 <w:bCs/>
                 <w:i w:val="false"/>
                 <w:iCs w:val="false"/>
-                <w:color w:val="1a1917"/>
-                <w:sz w:val="20"/>
-                <w:szCs w:val="20"/>
-              </w:rPr>
-              <w:t xml:space="preserve">Người soát xét</w:t>
-            </w:r>
-          </w:p>
-          <w:p>
-            <w:pPr>
-              <w:spacing w:after="40" w:before="0"/>
-              <w:jc w:val="center"/>
-            </w:pPr>
-            <w:r>
-              <w:rPr>
-                <w:rFonts w:ascii="Arial" w:cs="Arial" w:eastAsia="Arial" w:hAnsi="Arial"/>
-                <w:b w:val="false"/>
-                <w:bCs w:val="false"/>
-                <w:i/>
-                <w:iCs/>
-                <w:color w:val="1a1917"/>
-                <w:sz w:val="20"/>
-                <w:szCs w:val="20"/>
-              </w:rPr>
-              <w:t xml:space="preserve">Reviewed by</w:t>
-            </w:r>
-          </w:p>
-        </w:tc>
-        <w:tc>
-          <w:tcPr>
-            <w:tcW w:type="dxa" w:w="1458"/>
-            <w:tcBorders>
-              <w:top w:val="single" w:color="767171" w:sz="4"/>
-              <w:left w:val="single" w:color="767171" w:sz="4"/>
-              <w:bottom w:val="single" w:color="767171" w:sz="4"/>
-              <w:right w:val="single" w:color="767171" w:sz="4"/>
-            </w:tcBorders>
-            <w:tcMar>
-              <w:top w:type="dxa" w:w="80"/>
-              <w:left w:type="dxa" w:w="100"/>
-              <w:bottom w:type="dxa" w:w="80"/>
-              <w:right w:type="dxa" w:w="150"/>
-            </w:tcMar>
-            <w:vAlign w:val="center"/>
-          </w:tcPr>
-          <w:p>
-            <w:pPr>
-              <w:spacing w:after="0" w:before="60"/>
+                <w:color w:val="1a1a1a"/>
+                <w:sz w:val="20"/>
+                <w:szCs w:val="20"/>
+              </w:rPr>
+              <w:t xml:space="preserve">Lê Cảnh Nhật Quang</w:t>
+            </w:r>
+          </w:p>
+        </w:tc>
+        <w:tc>
+          <w:tcPr>
+            <w:tcW w:type="dxa" w:w="4536"/>
+            <w:tcBorders>
+              <w:top w:val="none" w:color="auto" w:sz="0"/>
+              <w:left w:val="none" w:color="auto" w:sz="0"/>
+              <w:bottom w:val="none" w:color="auto" w:sz="0"/>
+              <w:right w:val="none" w:color="auto" w:sz="0"/>
+            </w:tcBorders>
+            <w:vAlign w:val="center"/>
+          </w:tcPr>
+          <w:p>
+            <w:pPr>
+              <w:spacing w:after="40" w:before="60"/>
               <w:jc w:val="center"/>
             </w:pPr>
             <w:r>
@@ -2670,180 +2233,7 @@
                 <w:bCs/>
                 <w:i w:val="false"/>
                 <w:iCs w:val="false"/>
-                <w:color w:val="1a1917"/>
-                <w:sz w:val="20"/>
-                <w:szCs w:val="20"/>
-              </w:rPr>
-              <w:t xml:space="preserve">Giám đốc</w:t>
-            </w:r>
-          </w:p>
-          <w:p>
-            <w:pPr>
-              <w:spacing w:after="40" w:before="0"/>
-              <w:jc w:val="center"/>
-            </w:pPr>
-            <w:r>
-              <w:rPr>
-                <w:rFonts w:ascii="Arial" w:cs="Arial" w:eastAsia="Arial" w:hAnsi="Arial"/>
-                <w:b w:val="false"/>
-                <w:bCs w:val="false"/>
-                <w:i/>
-                <w:iCs/>
-                <w:color w:val="1a1917"/>
-                <w:sz w:val="20"/>
-                <w:szCs w:val="20"/>
-              </w:rPr>
-              <w:t xml:space="preserve">Director</w:t>
-            </w:r>
-          </w:p>
-        </w:tc>
-      </w:tr>
-      <w:tr>
-        <w:tc>
-          <w:tcPr>
-            <w:tcW w:type="dxa" w:w="7614"/>
-            <w:gridSpan w:val="3"/>
-            <w:tcBorders>
-              <w:top w:val="single" w:color="767171" w:sz="4"/>
-              <w:left w:val="single" w:color="767171" w:sz="4"/>
-              <w:bottom w:val="single" w:color="767171" w:sz="4"/>
-              <w:right w:val="single" w:color="767171" w:sz="4"/>
-            </w:tcBorders>
-            <w:tcMar>
-              <w:top w:type="dxa" w:w="80"/>
-              <w:left w:type="dxa" w:w="100"/>
-              <w:bottom w:type="dxa" w:w="80"/>
-              <w:right w:type="dxa" w:w="150"/>
-            </w:tcMar>
-            <w:vAlign w:val="center"/>
-          </w:tcPr>
-          <w:p>
-            <w:pPr>
-              <w:spacing w:before="400"/>
-              <w:jc w:val="left"/>
-            </w:pPr>
-            <w:r>
-              <w:rPr>
-                <w:rFonts w:ascii="Arial" w:cs="Arial" w:eastAsia="Arial" w:hAnsi="Arial"/>
-                <w:b w:val="false"/>
-                <w:bCs w:val="false"/>
-                <w:i w:val="false"/>
-                <w:iCs w:val="false"/>
-                <w:color w:val="1a1917"/>
-                <w:sz w:val="20"/>
-                <w:szCs w:val="20"/>
-              </w:rPr>
-              <w:t xml:space="preserve"/>
-            </w:r>
-          </w:p>
-        </w:tc>
-        <w:tc>
-          <w:tcPr>
-            <w:tcW w:type="dxa" w:w="1458"/>
-            <w:tcBorders>
-              <w:top w:val="single" w:color="767171" w:sz="4"/>
-              <w:left w:val="single" w:color="767171" w:sz="4"/>
-              <w:bottom w:val="single" w:color="767171" w:sz="4"/>
-              <w:right w:val="single" w:color="767171" w:sz="4"/>
-            </w:tcBorders>
-            <w:tcMar>
-              <w:top w:type="dxa" w:w="80"/>
-              <w:left w:type="dxa" w:w="100"/>
-              <w:bottom w:type="dxa" w:w="80"/>
-              <w:right w:type="dxa" w:w="150"/>
-            </w:tcMar>
-            <w:vAlign w:val="center"/>
-          </w:tcPr>
-          <w:p>
-            <w:pPr>
-              <w:spacing w:before="400"/>
-              <w:jc w:val="left"/>
-            </w:pPr>
-            <w:r>
-              <w:rPr>
-                <w:rFonts w:ascii="Arial" w:cs="Arial" w:eastAsia="Arial" w:hAnsi="Arial"/>
-                <w:b w:val="false"/>
-                <w:bCs w:val="false"/>
-                <w:i w:val="false"/>
-                <w:iCs w:val="false"/>
-                <w:color w:val="1a1917"/>
-                <w:sz w:val="20"/>
-                <w:szCs w:val="20"/>
-              </w:rPr>
-              <w:t xml:space="preserve"/>
-            </w:r>
-          </w:p>
-        </w:tc>
-      </w:tr>
-      <w:tr>
-        <w:tc>
-          <w:tcPr>
-            <w:tcW w:type="dxa" w:w="7614"/>
-            <w:gridSpan w:val="3"/>
-            <w:tcBorders>
-              <w:top w:val="single" w:color="767171" w:sz="4"/>
-              <w:left w:val="single" w:color="767171" w:sz="4"/>
-              <w:bottom w:val="single" w:color="767171" w:sz="4"/>
-              <w:right w:val="single" w:color="767171" w:sz="4"/>
-            </w:tcBorders>
-            <w:tcMar>
-              <w:top w:type="dxa" w:w="80"/>
-              <w:left w:type="dxa" w:w="100"/>
-              <w:bottom w:type="dxa" w:w="80"/>
-              <w:right w:type="dxa" w:w="150"/>
-            </w:tcMar>
-            <w:vAlign w:val="center"/>
-          </w:tcPr>
-          <w:p>
-            <w:pPr>
-              <w:spacing w:after="40" w:before="40"/>
-              <w:jc w:val="center"/>
-            </w:pPr>
-            <w:r>
-              <w:rPr>
-                <w:rFonts w:ascii="Arial" w:cs="Arial" w:eastAsia="Arial" w:hAnsi="Arial"/>
-                <w:b/>
-                <w:bCs/>
-                <w:i w:val="false"/>
-                <w:iCs w:val="false"/>
-                <w:color w:val="1a1917"/>
-                <w:sz w:val="20"/>
-                <w:szCs w:val="20"/>
-              </w:rPr>
-              <w:t xml:space="preserve">Lê Cảnh Nhật Quang</w:t>
-            </w:r>
-          </w:p>
-        </w:tc>
-        <w:tc>
-          <w:tcPr>
-            <w:tcW w:type="dxa" w:w="1458"/>
-            <w:tcBorders>
-              <w:top w:val="single" w:color="767171" w:sz="4"/>
-              <w:left w:val="single" w:color="767171" w:sz="4"/>
-              <w:bottom w:val="single" w:color="767171" w:sz="4"/>
-              <w:right w:val="single" w:color="767171" w:sz="4"/>
-            </w:tcBorders>
-            <w:tcMar>
-              <w:top w:type="dxa" w:w="80"/>
-              <w:left w:type="dxa" w:w="100"/>
-              <w:bottom w:type="dxa" w:w="80"/>
-              <w:right w:type="dxa" w:w="150"/>
-            </w:tcMar>
-            <w:vAlign w:val="center"/>
-          </w:tcPr>
-          <w:p>
-            <w:pPr>
-              <w:spacing w:after="40" w:before="40"/>
-              <w:jc w:val="center"/>
-            </w:pPr>
-            <w:r>
-              <w:rPr>
-                <w:rFonts w:ascii="Arial" w:cs="Arial" w:eastAsia="Arial" w:hAnsi="Arial"/>
-                <w:b/>
-                <w:bCs/>
-                <w:i w:val="false"/>
-                <w:iCs w:val="false"/>
-                <w:color w:val="1a1917"/>
+                <w:color w:val="1a1a1a"/>
                 <w:sz w:val="20"/>
                 <w:szCs w:val="20"/>
               </w:rPr>
@@ -2865,7 +2255,7 @@
           <w:bCs w:val="false"/>
           <w:i w:val="false"/>
           <w:iCs w:val="false"/>
-          <w:color w:val="1a1917"/>
+          <w:color w:val="1a1a1a"/>
           <w:sz w:val="20"/>
           <w:szCs w:val="20"/>
         </w:rPr>
@@ -2884,7 +2274,7 @@
           <w:bCs w:val="false"/>
           <w:i w:val="false"/>
           <w:iCs w:val="false"/>
-          <w:color w:val="1a1917"/>
+          <w:color w:val="1a1a1a"/>
           <w:sz w:val="20"/>
           <w:szCs w:val="20"/>
         </w:rPr>
@@ -2897,7 +2287,7 @@
           <w:bCs w:val="false"/>
           <w:i w:val="false"/>
           <w:iCs w:val="false"/>
-          <w:color w:val="1a1917"/>
+          <w:color w:val="1a1a1a"/>
           <w:sz w:val="20"/>
           <w:szCs w:val="20"/>
         </w:rPr>
@@ -2916,7 +2306,7 @@
           <w:bCs/>
           <w:i w:val="false"/>
           <w:iCs w:val="false"/>
-          <w:color w:val="1a1917"/>
+          <w:color w:val="1a1a1a"/>
           <w:sz w:val="20"/>
           <w:szCs w:val="20"/>
         </w:rPr>
@@ -2943,6 +2333,7 @@
         <w:gridCol w:w="100"/>
         <w:gridCol w:w="100"/>
         <w:gridCol w:w="100"/>
+        <w:gridCol w:w="100"/>
       </w:tblGrid>
       <w:tr>
         <w:trPr>
@@ -2950,12 +2341,12 @@
         </w:trPr>
         <w:tc>
           <w:tcPr>
-            <w:tcW w:type="dxa" w:w="1998"/>
-            <w:tcBorders>
-              <w:top w:val="single" w:color="767171" w:sz="4"/>
-              <w:left w:val="single" w:color="767171" w:sz="4"/>
-              <w:bottom w:val="single" w:color="767171" w:sz="4"/>
-              <w:right w:val="single" w:color="767171" w:sz="4"/>
+            <w:tcW w:type="dxa" w:w="1500"/>
+            <w:tcBorders>
+              <w:top w:val="single" w:color="000000" w:sz="4"/>
+              <w:left w:val="single" w:color="000000" w:sz="4"/>
+              <w:bottom w:val="single" w:color="000000" w:sz="4"/>
+              <w:right w:val="single" w:color="000000" w:sz="4"/>
             </w:tcBorders>
             <w:shd w:fill="F2F2F2"/>
             <w:tcMar>
@@ -2978,9 +2369,9 @@
                 <w:bCs/>
                 <w:i w:val="false"/>
                 <w:iCs w:val="false"/>
-                <w:color w:val="1a1917"/>
-                <w:sz w:val="20"/>
-                <w:szCs w:val="20"/>
+                <w:color w:val="1a1a1a"/>
+                <w:sz w:val="18"/>
+                <w:szCs w:val="18"/>
               </w:rPr>
               <w:t xml:space="preserve">Thông số</w:t>
             </w:r>
@@ -2997,9 +2388,9 @@
                 <w:bCs/>
                 <w:i/>
                 <w:iCs/>
-                <w:color w:val="1a1917"/>
-                <w:sz w:val="20"/>
-                <w:szCs w:val="20"/>
+                <w:color w:val="1a1a1a"/>
+                <w:sz w:val="18"/>
+                <w:szCs w:val="18"/>
               </w:rPr>
               <w:t xml:space="preserve">Parameters</w:t>
             </w:r>
@@ -3007,12 +2398,12 @@
         </w:tc>
         <w:tc>
           <w:tcPr>
-            <w:tcW w:type="dxa" w:w="1731"/>
-            <w:tcBorders>
-              <w:top w:val="single" w:color="767171" w:sz="4"/>
-              <w:left w:val="single" w:color="767171" w:sz="4"/>
-              <w:bottom w:val="single" w:color="767171" w:sz="4"/>
-              <w:right w:val="single" w:color="767171" w:sz="4"/>
+            <w:tcW w:type="dxa" w:w="1500"/>
+            <w:tcBorders>
+              <w:top w:val="single" w:color="000000" w:sz="4"/>
+              <w:left w:val="single" w:color="000000" w:sz="4"/>
+              <w:bottom w:val="single" w:color="000000" w:sz="4"/>
+              <w:right w:val="single" w:color="000000" w:sz="4"/>
             </w:tcBorders>
             <w:shd w:fill="F2F2F2"/>
             <w:tcMar>
@@ -3035,9 +2426,9 @@
                 <w:bCs/>
                 <w:i w:val="false"/>
                 <w:iCs w:val="false"/>
-                <w:color w:val="1a1917"/>
-                <w:sz w:val="20"/>
-                <w:szCs w:val="20"/>
+                <w:color w:val="1a1a1a"/>
+                <w:sz w:val="18"/>
+                <w:szCs w:val="18"/>
               </w:rPr>
               <w:t xml:space="preserve">Điểm hiệu chuẩn</w:t>
             </w:r>
@@ -3054,9 +2445,9 @@
                 <w:bCs/>
                 <w:i/>
                 <w:iCs/>
-                <w:color w:val="1a1917"/>
-                <w:sz w:val="20"/>
-                <w:szCs w:val="20"/>
+                <w:color w:val="1a1a1a"/>
+                <w:sz w:val="18"/>
+                <w:szCs w:val="18"/>
               </w:rPr>
               <w:t xml:space="preserve">Calibration Points</w:t>
             </w:r>
@@ -3064,12 +2455,12 @@
         </w:tc>
         <w:tc>
           <w:tcPr>
-            <w:tcW w:type="dxa" w:w="1649"/>
-            <w:tcBorders>
-              <w:top w:val="single" w:color="767171" w:sz="4"/>
-              <w:left w:val="single" w:color="767171" w:sz="4"/>
-              <w:bottom w:val="single" w:color="767171" w:sz="4"/>
-              <w:right w:val="single" w:color="767171" w:sz="4"/>
+            <w:tcW w:type="dxa" w:w="1300"/>
+            <w:tcBorders>
+              <w:top w:val="single" w:color="000000" w:sz="4"/>
+              <w:left w:val="single" w:color="000000" w:sz="4"/>
+              <w:bottom w:val="single" w:color="000000" w:sz="4"/>
+              <w:right w:val="single" w:color="000000" w:sz="4"/>
             </w:tcBorders>
             <w:shd w:fill="F2F2F2"/>
             <w:tcMar>
@@ -3092,9 +2483,9 @@
                 <w:bCs/>
                 <w:i w:val="false"/>
                 <w:iCs w:val="false"/>
-                <w:color w:val="1a1917"/>
-                <w:sz w:val="20"/>
-                <w:szCs w:val="20"/>
+                <w:color w:val="1a1a1a"/>
+                <w:sz w:val="18"/>
+                <w:szCs w:val="18"/>
               </w:rPr>
               <w:t xml:space="preserve">Giá trị đo được</w:t>
             </w:r>
@@ -3111,9 +2502,9 @@
                 <w:bCs/>
                 <w:i/>
                 <w:iCs/>
-                <w:color w:val="1a1917"/>
-                <w:sz w:val="20"/>
-                <w:szCs w:val="20"/>
+                <w:color w:val="1a1a1a"/>
+                <w:sz w:val="18"/>
+                <w:szCs w:val="18"/>
               </w:rPr>
               <w:t xml:space="preserve">As Found Value</w:t>
             </w:r>
@@ -3121,12 +2512,12 @@
         </w:tc>
         <w:tc>
           <w:tcPr>
-            <w:tcW w:type="dxa" w:w="1251"/>
-            <w:tcBorders>
-              <w:top w:val="single" w:color="767171" w:sz="4"/>
-              <w:left w:val="single" w:color="767171" w:sz="4"/>
-              <w:bottom w:val="single" w:color="767171" w:sz="4"/>
-              <w:right w:val="single" w:color="767171" w:sz="4"/>
+            <w:tcW w:type="dxa" w:w="1200"/>
+            <w:tcBorders>
+              <w:top w:val="single" w:color="000000" w:sz="4"/>
+              <w:left w:val="single" w:color="000000" w:sz="4"/>
+              <w:bottom w:val="single" w:color="000000" w:sz="4"/>
+              <w:right w:val="single" w:color="000000" w:sz="4"/>
             </w:tcBorders>
             <w:shd w:fill="F2F2F2"/>
             <w:tcMar>
@@ -3149,9 +2540,9 @@
                 <w:bCs/>
                 <w:i w:val="false"/>
                 <w:iCs w:val="false"/>
-                <w:color w:val="1a1917"/>
-                <w:sz w:val="20"/>
-                <w:szCs w:val="20"/>
+                <w:color w:val="1a1a1a"/>
+                <w:sz w:val="18"/>
+                <w:szCs w:val="18"/>
               </w:rPr>
               <w:t xml:space="preserve">Độ KĐBĐ</w:t>
             </w:r>
@@ -3168,9 +2559,9 @@
                 <w:bCs/>
                 <w:i/>
                 <w:iCs/>
-                <w:color w:val="1a1917"/>
-                <w:sz w:val="20"/>
-                <w:szCs w:val="20"/>
+                <w:color w:val="1a1a1a"/>
+                <w:sz w:val="18"/>
+                <w:szCs w:val="18"/>
               </w:rPr>
               <w:t xml:space="preserve">Uncertainty</w:t>
             </w:r>
@@ -3178,12 +2569,12 @@
         </w:tc>
         <w:tc>
           <w:tcPr>
-            <w:tcW w:type="dxa" w:w="1149"/>
-            <w:tcBorders>
-              <w:top w:val="single" w:color="767171" w:sz="4"/>
-              <w:left w:val="single" w:color="767171" w:sz="4"/>
-              <w:bottom w:val="single" w:color="767171" w:sz="4"/>
-              <w:right w:val="single" w:color="767171" w:sz="4"/>
+            <w:tcW w:type="dxa" w:w="1100"/>
+            <w:tcBorders>
+              <w:top w:val="single" w:color="000000" w:sz="4"/>
+              <w:left w:val="single" w:color="000000" w:sz="4"/>
+              <w:bottom w:val="single" w:color="000000" w:sz="4"/>
+              <w:right w:val="single" w:color="000000" w:sz="4"/>
             </w:tcBorders>
             <w:shd w:fill="F2F2F2"/>
             <w:tcMar>
@@ -3206,9 +2597,9 @@
                 <w:bCs/>
                 <w:i w:val="false"/>
                 <w:iCs w:val="false"/>
-                <w:color w:val="1a1917"/>
-                <w:sz w:val="20"/>
-                <w:szCs w:val="20"/>
+                <w:color w:val="1a1a1a"/>
+                <w:sz w:val="18"/>
+                <w:szCs w:val="18"/>
               </w:rPr>
               <w:t xml:space="preserve">Dung sai</w:t>
             </w:r>
@@ -3225,9 +2616,9 @@
                 <w:bCs/>
                 <w:i/>
                 <w:iCs/>
-                <w:color w:val="1a1917"/>
-                <w:sz w:val="20"/>
-                <w:szCs w:val="20"/>
+                <w:color w:val="1a1a1a"/>
+                <w:sz w:val="18"/>
+                <w:szCs w:val="18"/>
               </w:rPr>
               <w:t xml:space="preserve">Tolerance</w:t>
             </w:r>
@@ -3235,12 +2626,12 @@
         </w:tc>
         <w:tc>
           <w:tcPr>
-            <w:tcW w:type="dxa" w:w="1294"/>
-            <w:tcBorders>
-              <w:top w:val="single" w:color="767171" w:sz="4"/>
-              <w:left w:val="single" w:color="767171" w:sz="4"/>
-              <w:bottom w:val="single" w:color="767171" w:sz="4"/>
-              <w:right w:val="single" w:color="767171" w:sz="4"/>
+            <w:tcW w:type="dxa" w:w="1100"/>
+            <w:tcBorders>
+              <w:top w:val="single" w:color="000000" w:sz="4"/>
+              <w:left w:val="single" w:color="000000" w:sz="4"/>
+              <w:bottom w:val="single" w:color="000000" w:sz="4"/>
+              <w:right w:val="single" w:color="000000" w:sz="4"/>
             </w:tcBorders>
             <w:shd w:fill="F2F2F2"/>
             <w:tcMar>
@@ -3263,9 +2654,9 @@
                 <w:bCs/>
                 <w:i w:val="false"/>
                 <w:iCs w:val="false"/>
-                <w:color w:val="1a1917"/>
-                <w:sz w:val="20"/>
-                <w:szCs w:val="20"/>
+                <w:color w:val="1a1a1a"/>
+                <w:sz w:val="18"/>
+                <w:szCs w:val="18"/>
               </w:rPr>
               <w:t xml:space="preserve">Sự phù hợp</w:t>
             </w:r>
@@ -3282,11 +2673,68 @@
                 <w:bCs/>
                 <w:i/>
                 <w:iCs/>
-                <w:color w:val="1a1917"/>
-                <w:sz w:val="20"/>
-                <w:szCs w:val="20"/>
+                <w:color w:val="1a1a1a"/>
+                <w:sz w:val="18"/>
+                <w:szCs w:val="18"/>
               </w:rPr>
               <w:t xml:space="preserve">Conformity</w:t>
+            </w:r>
+          </w:p>
+        </w:tc>
+        <w:tc>
+          <w:tcPr>
+            <w:tcW w:type="dxa" w:w="1372"/>
+            <w:tcBorders>
+              <w:top w:val="single" w:color="000000" w:sz="4"/>
+              <w:left w:val="single" w:color="000000" w:sz="4"/>
+              <w:bottom w:val="single" w:color="000000" w:sz="4"/>
+              <w:right w:val="single" w:color="000000" w:sz="4"/>
+            </w:tcBorders>
+            <w:shd w:fill="F2F2F2"/>
+            <w:tcMar>
+              <w:top w:type="dxa" w:w="80"/>
+              <w:left w:type="dxa" w:w="100"/>
+              <w:bottom w:type="dxa" w:w="80"/>
+              <w:right w:type="dxa" w:w="150"/>
+            </w:tcMar>
+            <w:vAlign w:val="center"/>
+          </w:tcPr>
+          <w:p>
+            <w:pPr>
+              <w:spacing w:after="0" w:before="40"/>
+              <w:jc w:val="center"/>
+            </w:pPr>
+            <w:r>
+              <w:rPr>
+                <w:rFonts w:ascii="Arial" w:cs="Arial" w:eastAsia="Arial" w:hAnsi="Arial"/>
+                <w:b/>
+                <w:bCs/>
+                <w:i w:val="false"/>
+                <w:iCs w:val="false"/>
+                <w:color w:val="1a1a1a"/>
+                <w:sz w:val="18"/>
+                <w:szCs w:val="18"/>
+              </w:rPr>
+              <w:t xml:space="preserve">Thiết bị chuẩn</w:t>
+            </w:r>
+          </w:p>
+          <w:p>
+            <w:pPr>
+              <w:spacing w:after="40" w:before="0"/>
+              <w:jc w:val="center"/>
+            </w:pPr>
+            <w:r>
+              <w:rPr>
+                <w:rFonts w:ascii="Arial" w:cs="Arial" w:eastAsia="Arial" w:hAnsi="Arial"/>
+                <w:b/>
+                <w:bCs/>
+                <w:i/>
+                <w:iCs/>
+                <w:color w:val="1a1a1a"/>
+                <w:sz w:val="18"/>
+                <w:szCs w:val="18"/>
+              </w:rPr>
+              <w:t xml:space="preserve">Std. Equipment</w:t>
             </w:r>
           </w:p>
         </w:tc>
@@ -3294,12 +2742,12 @@
       <w:tr>
         <w:tc>
           <w:tcPr>
-            <w:tcW w:type="dxa" w:w="1998"/>
-            <w:tcBorders>
-              <w:top w:val="single" w:color="767171" w:sz="4"/>
-              <w:left w:val="single" w:color="767171" w:sz="4"/>
-              <w:bottom w:val="single" w:color="767171" w:sz="4"/>
-              <w:right w:val="single" w:color="767171" w:sz="4"/>
+            <w:tcW w:type="dxa" w:w="1500"/>
+            <w:tcBorders>
+              <w:top w:val="single" w:color="000000" w:sz="4"/>
+              <w:left w:val="single" w:color="000000" w:sz="4"/>
+              <w:bottom w:val="single" w:color="000000" w:sz="4"/>
+              <w:right w:val="single" w:color="000000" w:sz="4"/>
             </w:tcBorders>
             <w:tcMar>
               <w:top w:type="dxa" w:w="80"/>
@@ -3321,22 +2769,22 @@
                 <w:bCs/>
                 <w:i w:val="false"/>
                 <w:iCs w:val="false"/>
-                <w:color w:val="1a1917"/>
-                <w:sz w:val="20"/>
-                <w:szCs w:val="20"/>
-              </w:rPr>
-              <w:t xml:space="preserve">Tốc độ quay</w:t>
-            </w:r>
-          </w:p>
-        </w:tc>
-        <w:tc>
-          <w:tcPr>
-            <w:tcW w:type="dxa" w:w="1731"/>
-            <w:tcBorders>
-              <w:top w:val="single" w:color="767171" w:sz="4"/>
-              <w:left w:val="single" w:color="767171" w:sz="4"/>
-              <w:bottom w:val="single" w:color="767171" w:sz="4"/>
-              <w:right w:val="single" w:color="767171" w:sz="4"/>
+                <w:color w:val="1a1a1a"/>
+                <w:sz w:val="18"/>
+                <w:szCs w:val="18"/>
+              </w:rPr>
+              <w:t xml:space="preserve">nhiệt độ</w:t>
+            </w:r>
+          </w:p>
+        </w:tc>
+        <w:tc>
+          <w:tcPr>
+            <w:tcW w:type="dxa" w:w="1500"/>
+            <w:tcBorders>
+              <w:top w:val="single" w:color="000000" w:sz="4"/>
+              <w:left w:val="single" w:color="000000" w:sz="4"/>
+              <w:bottom w:val="single" w:color="000000" w:sz="4"/>
+              <w:right w:val="single" w:color="000000" w:sz="4"/>
             </w:tcBorders>
             <w:tcMar>
               <w:top w:type="dxa" w:w="80"/>
@@ -3358,22 +2806,22 @@
                 <w:bCs w:val="false"/>
                 <w:i w:val="false"/>
                 <w:iCs w:val="false"/>
-                <w:color w:val="1a1917"/>
-                <w:sz w:val="20"/>
-                <w:szCs w:val="20"/>
-              </w:rPr>
-              <w:t xml:space="preserve">30</w:t>
-            </w:r>
-          </w:p>
-        </w:tc>
-        <w:tc>
-          <w:tcPr>
-            <w:tcW w:type="dxa" w:w="1649"/>
-            <w:tcBorders>
-              <w:top w:val="single" w:color="767171" w:sz="4"/>
-              <w:left w:val="single" w:color="767171" w:sz="4"/>
-              <w:bottom w:val="single" w:color="767171" w:sz="4"/>
-              <w:right w:val="single" w:color="767171" w:sz="4"/>
+                <w:color w:val="1a1a1a"/>
+                <w:sz w:val="18"/>
+                <w:szCs w:val="18"/>
+              </w:rPr>
+              <w:t xml:space="preserve">12</w:t>
+            </w:r>
+          </w:p>
+        </w:tc>
+        <w:tc>
+          <w:tcPr>
+            <w:tcW w:type="dxa" w:w="1300"/>
+            <w:tcBorders>
+              <w:top w:val="single" w:color="000000" w:sz="4"/>
+              <w:left w:val="single" w:color="000000" w:sz="4"/>
+              <w:bottom w:val="single" w:color="000000" w:sz="4"/>
+              <w:right w:val="single" w:color="000000" w:sz="4"/>
             </w:tcBorders>
             <w:tcMar>
               <w:top w:type="dxa" w:w="80"/>
@@ -3395,22 +2843,22 @@
                 <w:bCs w:val="false"/>
                 <w:i w:val="false"/>
                 <w:iCs w:val="false"/>
-                <w:color w:val="1a1917"/>
-                <w:sz w:val="20"/>
-                <w:szCs w:val="20"/>
-              </w:rPr>
-              <w:t xml:space="preserve">–</w:t>
-            </w:r>
-          </w:p>
-        </w:tc>
-        <w:tc>
-          <w:tcPr>
-            <w:tcW w:type="dxa" w:w="1251"/>
-            <w:tcBorders>
-              <w:top w:val="single" w:color="767171" w:sz="4"/>
-              <w:left w:val="single" w:color="767171" w:sz="4"/>
-              <w:bottom w:val="single" w:color="767171" w:sz="4"/>
-              <w:right w:val="single" w:color="767171" w:sz="4"/>
+                <w:color w:val="1a1a1a"/>
+                <w:sz w:val="18"/>
+                <w:szCs w:val="18"/>
+              </w:rPr>
+              <w:t xml:space="preserve">46 / 43 / 23</w:t>
+            </w:r>
+          </w:p>
+        </w:tc>
+        <w:tc>
+          <w:tcPr>
+            <w:tcW w:type="dxa" w:w="1200"/>
+            <w:tcBorders>
+              <w:top w:val="single" w:color="000000" w:sz="4"/>
+              <w:left w:val="single" w:color="000000" w:sz="4"/>
+              <w:bottom w:val="single" w:color="000000" w:sz="4"/>
+              <w:right w:val="single" w:color="000000" w:sz="4"/>
             </w:tcBorders>
             <w:tcMar>
               <w:top w:type="dxa" w:w="80"/>
@@ -3432,22 +2880,22 @@
                 <w:bCs w:val="false"/>
                 <w:i w:val="false"/>
                 <w:iCs w:val="false"/>
-                <w:color w:val="1a1917"/>
-                <w:sz w:val="20"/>
-                <w:szCs w:val="20"/>
-              </w:rPr>
-              <w:t xml:space="preserve">0.3</w:t>
-            </w:r>
-          </w:p>
-        </w:tc>
-        <w:tc>
-          <w:tcPr>
-            <w:tcW w:type="dxa" w:w="1149"/>
-            <w:tcBorders>
-              <w:top w:val="single" w:color="767171" w:sz="4"/>
-              <w:left w:val="single" w:color="767171" w:sz="4"/>
-              <w:bottom w:val="single" w:color="767171" w:sz="4"/>
-              <w:right w:val="single" w:color="767171" w:sz="4"/>
+                <w:color w:val="1a1a1a"/>
+                <w:sz w:val="18"/>
+                <w:szCs w:val="18"/>
+              </w:rPr>
+              <w:t xml:space="preserve">+-3</w:t>
+            </w:r>
+          </w:p>
+        </w:tc>
+        <w:tc>
+          <w:tcPr>
+            <w:tcW w:type="dxa" w:w="1100"/>
+            <w:tcBorders>
+              <w:top w:val="single" w:color="000000" w:sz="4"/>
+              <w:left w:val="single" w:color="000000" w:sz="4"/>
+              <w:bottom w:val="single" w:color="000000" w:sz="4"/>
+              <w:right w:val="single" w:color="000000" w:sz="4"/>
             </w:tcBorders>
             <w:tcMar>
               <w:top w:type="dxa" w:w="80"/>
@@ -3469,22 +2917,22 @@
                 <w:bCs w:val="false"/>
                 <w:i w:val="false"/>
                 <w:iCs w:val="false"/>
-                <w:color w:val="1a1917"/>
-                <w:sz w:val="20"/>
-                <w:szCs w:val="20"/>
-              </w:rPr>
-              <w:t xml:space="preserve">± 3</w:t>
-            </w:r>
-          </w:p>
-        </w:tc>
-        <w:tc>
-          <w:tcPr>
-            <w:tcW w:type="dxa" w:w="1294"/>
-            <w:tcBorders>
-              <w:top w:val="single" w:color="767171" w:sz="4"/>
-              <w:left w:val="single" w:color="767171" w:sz="4"/>
-              <w:bottom w:val="single" w:color="767171" w:sz="4"/>
-              <w:right w:val="single" w:color="767171" w:sz="4"/>
+                <w:color w:val="1a1a1a"/>
+                <w:sz w:val="18"/>
+                <w:szCs w:val="18"/>
+              </w:rPr>
+              <w:t xml:space="preserve">–</w:t>
+            </w:r>
+          </w:p>
+        </w:tc>
+        <w:tc>
+          <w:tcPr>
+            <w:tcW w:type="dxa" w:w="1100"/>
+            <w:tcBorders>
+              <w:top w:val="single" w:color="000000" w:sz="4"/>
+              <w:left w:val="single" w:color="000000" w:sz="4"/>
+              <w:bottom w:val="single" w:color="000000" w:sz="4"/>
+              <w:right w:val="single" w:color="000000" w:sz="4"/>
             </w:tcBorders>
             <w:tcMar>
               <w:top w:type="dxa" w:w="80"/>
@@ -3506,11 +2954,48 @@
                 <w:bCs w:val="false"/>
                 <w:i w:val="false"/>
                 <w:iCs w:val="false"/>
-                <w:color w:val="1a1917"/>
-                <w:sz w:val="20"/>
-                <w:szCs w:val="20"/>
-              </w:rPr>
-              <w:t xml:space="preserve">–</w:t>
+                <w:color w:val="1a1a1a"/>
+                <w:sz w:val="18"/>
+                <w:szCs w:val="18"/>
+              </w:rPr>
+              <w:t xml:space="preserve">A</w:t>
+            </w:r>
+          </w:p>
+        </w:tc>
+        <w:tc>
+          <w:tcPr>
+            <w:tcW w:type="dxa" w:w="1372"/>
+            <w:tcBorders>
+              <w:top w:val="single" w:color="000000" w:sz="4"/>
+              <w:left w:val="single" w:color="000000" w:sz="4"/>
+              <w:bottom w:val="single" w:color="000000" w:sz="4"/>
+              <w:right w:val="single" w:color="000000" w:sz="4"/>
+            </w:tcBorders>
+            <w:tcMar>
+              <w:top w:type="dxa" w:w="80"/>
+              <w:left w:type="dxa" w:w="100"/>
+              <w:bottom w:type="dxa" w:w="80"/>
+              <w:right w:type="dxa" w:w="150"/>
+            </w:tcMar>
+            <w:vAlign w:val="center"/>
+          </w:tcPr>
+          <w:p>
+            <w:pPr>
+              <w:spacing w:after="40" w:before="40"/>
+              <w:jc w:val="center"/>
+            </w:pPr>
+            <w:r>
+              <w:rPr>
+                <w:rFonts w:ascii="Arial" w:cs="Arial" w:eastAsia="Arial" w:hAnsi="Arial"/>
+                <w:b w:val="false"/>
+                <w:bCs w:val="false"/>
+                <w:i w:val="false"/>
+                <w:iCs w:val="false"/>
+                <w:color w:val="1a1a1a"/>
+                <w:sz w:val="18"/>
+                <w:szCs w:val="18"/>
+              </w:rPr>
+              <w:t xml:space="preserve">DH2</w:t>
             </w:r>
           </w:p>
         </w:tc>
@@ -3518,49 +3003,49 @@
       <w:tr>
         <w:tc>
           <w:tcPr>
-            <w:tcW w:type="dxa" w:w="1998"/>
-            <w:tcBorders>
-              <w:top w:val="single" w:color="767171" w:sz="4"/>
-              <w:left w:val="single" w:color="767171" w:sz="4"/>
-              <w:bottom w:val="single" w:color="767171" w:sz="4"/>
-              <w:right w:val="single" w:color="767171" w:sz="4"/>
-            </w:tcBorders>
-            <w:tcMar>
-              <w:top w:type="dxa" w:w="80"/>
-              <w:left w:type="dxa" w:w="100"/>
-              <w:bottom w:type="dxa" w:w="80"/>
-              <w:right w:type="dxa" w:w="150"/>
-            </w:tcMar>
-            <w:vAlign w:val="center"/>
-          </w:tcPr>
-          <w:p>
-            <w:pPr>
-              <w:spacing w:after="40" w:before="40"/>
-              <w:jc w:val="left"/>
-            </w:pPr>
-            <w:r>
-              <w:rPr>
-                <w:rFonts w:ascii="Arial" w:cs="Arial" w:eastAsia="Arial" w:hAnsi="Arial"/>
-                <w:b w:val="false"/>
-                <w:bCs w:val="false"/>
-                <w:i w:val="false"/>
-                <w:iCs w:val="false"/>
-                <w:color w:val="1a1917"/>
-                <w:sz w:val="20"/>
-                <w:szCs w:val="20"/>
-              </w:rPr>
-              <w:t xml:space="preserve"/>
-            </w:r>
-          </w:p>
-        </w:tc>
-        <w:tc>
-          <w:tcPr>
-            <w:tcW w:type="dxa" w:w="1731"/>
-            <w:tcBorders>
-              <w:top w:val="single" w:color="767171" w:sz="4"/>
-              <w:left w:val="single" w:color="767171" w:sz="4"/>
-              <w:bottom w:val="single" w:color="767171" w:sz="4"/>
-              <w:right w:val="single" w:color="767171" w:sz="4"/>
+            <w:tcW w:type="dxa" w:w="1500"/>
+            <w:tcBorders>
+              <w:top w:val="single" w:color="000000" w:sz="4"/>
+              <w:left w:val="single" w:color="000000" w:sz="4"/>
+              <w:bottom w:val="single" w:color="000000" w:sz="4"/>
+              <w:right w:val="single" w:color="000000" w:sz="4"/>
+            </w:tcBorders>
+            <w:tcMar>
+              <w:top w:type="dxa" w:w="80"/>
+              <w:left w:type="dxa" w:w="100"/>
+              <w:bottom w:type="dxa" w:w="80"/>
+              <w:right w:type="dxa" w:w="150"/>
+            </w:tcMar>
+            <w:vAlign w:val="center"/>
+          </w:tcPr>
+          <w:p>
+            <w:pPr>
+              <w:spacing w:after="0" w:before="40"/>
+              <w:jc w:val="left"/>
+            </w:pPr>
+            <w:r>
+              <w:rPr>
+                <w:rFonts w:ascii="Arial" w:cs="Arial" w:eastAsia="Arial" w:hAnsi="Arial"/>
+                <w:b/>
+                <w:bCs/>
+                <w:i w:val="false"/>
+                <w:iCs w:val="false"/>
+                <w:color w:val="1a1a1a"/>
+                <w:sz w:val="18"/>
+                <w:szCs w:val="18"/>
+              </w:rPr>
+              <w:t xml:space="preserve">tốc độ</w:t>
+            </w:r>
+          </w:p>
+        </w:tc>
+        <w:tc>
+          <w:tcPr>
+            <w:tcW w:type="dxa" w:w="1500"/>
+            <w:tcBorders>
+              <w:top w:val="single" w:color="000000" w:sz="4"/>
+              <w:left w:val="single" w:color="000000" w:sz="4"/>
+              <w:bottom w:val="single" w:color="000000" w:sz="4"/>
+              <w:right w:val="single" w:color="000000" w:sz="4"/>
             </w:tcBorders>
             <w:tcMar>
               <w:top w:type="dxa" w:w="80"/>
@@ -3582,22 +3067,22 @@
                 <w:bCs w:val="false"/>
                 <w:i w:val="false"/>
                 <w:iCs w:val="false"/>
-                <w:color w:val="1a1917"/>
-                <w:sz w:val="20"/>
-                <w:szCs w:val="20"/>
-              </w:rPr>
-              <w:t xml:space="preserve">50</w:t>
-            </w:r>
-          </w:p>
-        </w:tc>
-        <w:tc>
-          <w:tcPr>
-            <w:tcW w:type="dxa" w:w="1649"/>
-            <w:tcBorders>
-              <w:top w:val="single" w:color="767171" w:sz="4"/>
-              <w:left w:val="single" w:color="767171" w:sz="4"/>
-              <w:bottom w:val="single" w:color="767171" w:sz="4"/>
-              <w:right w:val="single" w:color="767171" w:sz="4"/>
+                <w:color w:val="1a1a1a"/>
+                <w:sz w:val="18"/>
+                <w:szCs w:val="18"/>
+              </w:rPr>
+              <w:t xml:space="preserve">32</w:t>
+            </w:r>
+          </w:p>
+        </w:tc>
+        <w:tc>
+          <w:tcPr>
+            <w:tcW w:type="dxa" w:w="1300"/>
+            <w:tcBorders>
+              <w:top w:val="single" w:color="000000" w:sz="4"/>
+              <w:left w:val="single" w:color="000000" w:sz="4"/>
+              <w:bottom w:val="single" w:color="000000" w:sz="4"/>
+              <w:right w:val="single" w:color="000000" w:sz="4"/>
             </w:tcBorders>
             <w:tcMar>
               <w:top w:type="dxa" w:w="80"/>
@@ -3619,22 +3104,22 @@
                 <w:bCs w:val="false"/>
                 <w:i w:val="false"/>
                 <w:iCs w:val="false"/>
-                <w:color w:val="1a1917"/>
-                <w:sz w:val="20"/>
-                <w:szCs w:val="20"/>
-              </w:rPr>
-              <w:t xml:space="preserve">–</w:t>
-            </w:r>
-          </w:p>
-        </w:tc>
-        <w:tc>
-          <w:tcPr>
-            <w:tcW w:type="dxa" w:w="1251"/>
-            <w:tcBorders>
-              <w:top w:val="single" w:color="767171" w:sz="4"/>
-              <w:left w:val="single" w:color="767171" w:sz="4"/>
-              <w:bottom w:val="single" w:color="767171" w:sz="4"/>
-              <w:right w:val="single" w:color="767171" w:sz="4"/>
+                <w:color w:val="1a1a1a"/>
+                <w:sz w:val="18"/>
+                <w:szCs w:val="18"/>
+              </w:rPr>
+              <w:t xml:space="preserve">54 / 32 / 4</w:t>
+            </w:r>
+          </w:p>
+        </w:tc>
+        <w:tc>
+          <w:tcPr>
+            <w:tcW w:type="dxa" w:w="1200"/>
+            <w:tcBorders>
+              <w:top w:val="single" w:color="000000" w:sz="4"/>
+              <w:left w:val="single" w:color="000000" w:sz="4"/>
+              <w:bottom w:val="single" w:color="000000" w:sz="4"/>
+              <w:right w:val="single" w:color="000000" w:sz="4"/>
             </w:tcBorders>
             <w:tcMar>
               <w:top w:type="dxa" w:w="80"/>
@@ -3656,22 +3141,22 @@
                 <w:bCs w:val="false"/>
                 <w:i w:val="false"/>
                 <w:iCs w:val="false"/>
-                <w:color w:val="1a1917"/>
-                <w:sz w:val="20"/>
-                <w:szCs w:val="20"/>
-              </w:rPr>
-              <w:t xml:space="preserve">0.3</w:t>
-            </w:r>
-          </w:p>
-        </w:tc>
-        <w:tc>
-          <w:tcPr>
-            <w:tcW w:type="dxa" w:w="1149"/>
-            <w:tcBorders>
-              <w:top w:val="single" w:color="767171" w:sz="4"/>
-              <w:left w:val="single" w:color="767171" w:sz="4"/>
-              <w:bottom w:val="single" w:color="767171" w:sz="4"/>
-              <w:right w:val="single" w:color="767171" w:sz="4"/>
+                <w:color w:val="1a1a1a"/>
+                <w:sz w:val="18"/>
+                <w:szCs w:val="18"/>
+              </w:rPr>
+              <w:t xml:space="preserve">–</w:t>
+            </w:r>
+          </w:p>
+        </w:tc>
+        <w:tc>
+          <w:tcPr>
+            <w:tcW w:type="dxa" w:w="1100"/>
+            <w:tcBorders>
+              <w:top w:val="single" w:color="000000" w:sz="4"/>
+              <w:left w:val="single" w:color="000000" w:sz="4"/>
+              <w:bottom w:val="single" w:color="000000" w:sz="4"/>
+              <w:right w:val="single" w:color="000000" w:sz="4"/>
             </w:tcBorders>
             <w:tcMar>
               <w:top w:type="dxa" w:w="80"/>
@@ -3693,22 +3178,22 @@
                 <w:bCs w:val="false"/>
                 <w:i w:val="false"/>
                 <w:iCs w:val="false"/>
-                <w:color w:val="1a1917"/>
-                <w:sz w:val="20"/>
-                <w:szCs w:val="20"/>
-              </w:rPr>
-              <w:t xml:space="preserve">± 3</w:t>
-            </w:r>
-          </w:p>
-        </w:tc>
-        <w:tc>
-          <w:tcPr>
-            <w:tcW w:type="dxa" w:w="1294"/>
-            <w:tcBorders>
-              <w:top w:val="single" w:color="767171" w:sz="4"/>
-              <w:left w:val="single" w:color="767171" w:sz="4"/>
-              <w:bottom w:val="single" w:color="767171" w:sz="4"/>
-              <w:right w:val="single" w:color="767171" w:sz="4"/>
+                <w:color w:val="1a1a1a"/>
+                <w:sz w:val="18"/>
+                <w:szCs w:val="18"/>
+              </w:rPr>
+              <w:t xml:space="preserve">–</w:t>
+            </w:r>
+          </w:p>
+        </w:tc>
+        <w:tc>
+          <w:tcPr>
+            <w:tcW w:type="dxa" w:w="1100"/>
+            <w:tcBorders>
+              <w:top w:val="single" w:color="000000" w:sz="4"/>
+              <w:left w:val="single" w:color="000000" w:sz="4"/>
+              <w:bottom w:val="single" w:color="000000" w:sz="4"/>
+              <w:right w:val="single" w:color="000000" w:sz="4"/>
             </w:tcBorders>
             <w:tcMar>
               <w:top w:type="dxa" w:w="80"/>
@@ -3730,11 +3215,48 @@
                 <w:bCs w:val="false"/>
                 <w:i w:val="false"/>
                 <w:iCs w:val="false"/>
-                <w:color w:val="1a1917"/>
-                <w:sz w:val="20"/>
-                <w:szCs w:val="20"/>
-              </w:rPr>
-              <w:t xml:space="preserve">–</w:t>
+                <w:color w:val="1a1a1a"/>
+                <w:sz w:val="18"/>
+                <w:szCs w:val="18"/>
+              </w:rPr>
+              <w:t xml:space="preserve">A</w:t>
+            </w:r>
+          </w:p>
+        </w:tc>
+        <w:tc>
+          <w:tcPr>
+            <w:tcW w:type="dxa" w:w="1372"/>
+            <w:tcBorders>
+              <w:top w:val="single" w:color="000000" w:sz="4"/>
+              <w:left w:val="single" w:color="000000" w:sz="4"/>
+              <w:bottom w:val="single" w:color="000000" w:sz="4"/>
+              <w:right w:val="single" w:color="000000" w:sz="4"/>
+            </w:tcBorders>
+            <w:tcMar>
+              <w:top w:type="dxa" w:w="80"/>
+              <w:left w:type="dxa" w:w="100"/>
+              <w:bottom w:type="dxa" w:w="80"/>
+              <w:right w:type="dxa" w:w="150"/>
+            </w:tcMar>
+            <w:vAlign w:val="center"/>
+          </w:tcPr>
+          <w:p>
+            <w:pPr>
+              <w:spacing w:after="40" w:before="40"/>
+              <w:jc w:val="center"/>
+            </w:pPr>
+            <w:r>
+              <w:rPr>
+                <w:rFonts w:ascii="Arial" w:cs="Arial" w:eastAsia="Arial" w:hAnsi="Arial"/>
+                <w:b w:val="false"/>
+                <w:bCs w:val="false"/>
+                <w:i w:val="false"/>
+                <w:iCs w:val="false"/>
+                <w:color w:val="1a1a1a"/>
+                <w:sz w:val="18"/>
+                <w:szCs w:val="18"/>
+              </w:rPr>
+              <w:t xml:space="preserve">LAB-BALANCE.02 - Digital Balance</w:t>
             </w:r>
           </w:p>
         </w:tc>
@@ -3742,49 +3264,49 @@
       <w:tr>
         <w:tc>
           <w:tcPr>
-            <w:tcW w:type="dxa" w:w="1998"/>
-            <w:tcBorders>
-              <w:top w:val="single" w:color="767171" w:sz="4"/>
-              <w:left w:val="single" w:color="767171" w:sz="4"/>
-              <w:bottom w:val="single" w:color="767171" w:sz="4"/>
-              <w:right w:val="single" w:color="767171" w:sz="4"/>
-            </w:tcBorders>
-            <w:tcMar>
-              <w:top w:type="dxa" w:w="80"/>
-              <w:left w:type="dxa" w:w="100"/>
-              <w:bottom w:type="dxa" w:w="80"/>
-              <w:right w:type="dxa" w:w="150"/>
-            </w:tcMar>
-            <w:vAlign w:val="center"/>
-          </w:tcPr>
-          <w:p>
-            <w:pPr>
-              <w:spacing w:after="40" w:before="40"/>
-              <w:jc w:val="left"/>
-            </w:pPr>
-            <w:r>
-              <w:rPr>
-                <w:rFonts w:ascii="Arial" w:cs="Arial" w:eastAsia="Arial" w:hAnsi="Arial"/>
-                <w:b w:val="false"/>
-                <w:bCs w:val="false"/>
-                <w:i w:val="false"/>
-                <w:iCs w:val="false"/>
-                <w:color w:val="1a1917"/>
-                <w:sz w:val="20"/>
-                <w:szCs w:val="20"/>
-              </w:rPr>
-              <w:t xml:space="preserve"/>
-            </w:r>
-          </w:p>
-        </w:tc>
-        <w:tc>
-          <w:tcPr>
-            <w:tcW w:type="dxa" w:w="1731"/>
-            <w:tcBorders>
-              <w:top w:val="single" w:color="767171" w:sz="4"/>
-              <w:left w:val="single" w:color="767171" w:sz="4"/>
-              <w:bottom w:val="single" w:color="767171" w:sz="4"/>
-              <w:right w:val="single" w:color="767171" w:sz="4"/>
+            <w:tcW w:type="dxa" w:w="1500"/>
+            <w:tcBorders>
+              <w:top w:val="single" w:color="000000" w:sz="4"/>
+              <w:left w:val="single" w:color="000000" w:sz="4"/>
+              <w:bottom w:val="single" w:color="000000" w:sz="4"/>
+              <w:right w:val="single" w:color="000000" w:sz="4"/>
+            </w:tcBorders>
+            <w:tcMar>
+              <w:top w:type="dxa" w:w="80"/>
+              <w:left w:type="dxa" w:w="100"/>
+              <w:bottom w:type="dxa" w:w="80"/>
+              <w:right w:type="dxa" w:w="150"/>
+            </w:tcMar>
+            <w:vAlign w:val="center"/>
+          </w:tcPr>
+          <w:p>
+            <w:pPr>
+              <w:spacing w:after="0" w:before="40"/>
+              <w:jc w:val="left"/>
+            </w:pPr>
+            <w:r>
+              <w:rPr>
+                <w:rFonts w:ascii="Arial" w:cs="Arial" w:eastAsia="Arial" w:hAnsi="Arial"/>
+                <w:b/>
+                <w:bCs/>
+                <w:i w:val="false"/>
+                <w:iCs w:val="false"/>
+                <w:color w:val="1a1a1a"/>
+                <w:sz w:val="18"/>
+                <w:szCs w:val="18"/>
+              </w:rPr>
+              <w:t xml:space="preserve">mực nước</w:t>
+            </w:r>
+          </w:p>
+        </w:tc>
+        <w:tc>
+          <w:tcPr>
+            <w:tcW w:type="dxa" w:w="1500"/>
+            <w:tcBorders>
+              <w:top w:val="single" w:color="000000" w:sz="4"/>
+              <w:left w:val="single" w:color="000000" w:sz="4"/>
+              <w:bottom w:val="single" w:color="000000" w:sz="4"/>
+              <w:right w:val="single" w:color="000000" w:sz="4"/>
             </w:tcBorders>
             <w:tcMar>
               <w:top w:type="dxa" w:w="80"/>
@@ -3806,22 +3328,22 @@
                 <w:bCs w:val="false"/>
                 <w:i w:val="false"/>
                 <w:iCs w:val="false"/>
-                <w:color w:val="1a1917"/>
-                <w:sz w:val="20"/>
-                <w:szCs w:val="20"/>
-              </w:rPr>
-              <w:t xml:space="preserve">60</w:t>
-            </w:r>
-          </w:p>
-        </w:tc>
-        <w:tc>
-          <w:tcPr>
-            <w:tcW w:type="dxa" w:w="1649"/>
-            <w:tcBorders>
-              <w:top w:val="single" w:color="767171" w:sz="4"/>
-              <w:left w:val="single" w:color="767171" w:sz="4"/>
-              <w:bottom w:val="single" w:color="767171" w:sz="4"/>
-              <w:right w:val="single" w:color="767171" w:sz="4"/>
+                <w:color w:val="1a1a1a"/>
+                <w:sz w:val="18"/>
+                <w:szCs w:val="18"/>
+              </w:rPr>
+              <w:t xml:space="preserve">45</w:t>
+            </w:r>
+          </w:p>
+        </w:tc>
+        <w:tc>
+          <w:tcPr>
+            <w:tcW w:type="dxa" w:w="1300"/>
+            <w:tcBorders>
+              <w:top w:val="single" w:color="000000" w:sz="4"/>
+              <w:left w:val="single" w:color="000000" w:sz="4"/>
+              <w:bottom w:val="single" w:color="000000" w:sz="4"/>
+              <w:right w:val="single" w:color="000000" w:sz="4"/>
             </w:tcBorders>
             <w:tcMar>
               <w:top w:type="dxa" w:w="80"/>
@@ -3843,22 +3365,22 @@
                 <w:bCs w:val="false"/>
                 <w:i w:val="false"/>
                 <w:iCs w:val="false"/>
-                <w:color w:val="1a1917"/>
-                <w:sz w:val="20"/>
-                <w:szCs w:val="20"/>
-              </w:rPr>
-              <w:t xml:space="preserve">–</w:t>
-            </w:r>
-          </w:p>
-        </w:tc>
-        <w:tc>
-          <w:tcPr>
-            <w:tcW w:type="dxa" w:w="1251"/>
-            <w:tcBorders>
-              <w:top w:val="single" w:color="767171" w:sz="4"/>
-              <w:left w:val="single" w:color="767171" w:sz="4"/>
-              <w:bottom w:val="single" w:color="767171" w:sz="4"/>
-              <w:right w:val="single" w:color="767171" w:sz="4"/>
+                <w:color w:val="1a1a1a"/>
+                <w:sz w:val="18"/>
+                <w:szCs w:val="18"/>
+              </w:rPr>
+              <w:t xml:space="preserve">23 / 65 / 13</w:t>
+            </w:r>
+          </w:p>
+        </w:tc>
+        <w:tc>
+          <w:tcPr>
+            <w:tcW w:type="dxa" w:w="1200"/>
+            <w:tcBorders>
+              <w:top w:val="single" w:color="000000" w:sz="4"/>
+              <w:left w:val="single" w:color="000000" w:sz="4"/>
+              <w:bottom w:val="single" w:color="000000" w:sz="4"/>
+              <w:right w:val="single" w:color="000000" w:sz="4"/>
             </w:tcBorders>
             <w:tcMar>
               <w:top w:type="dxa" w:w="80"/>
@@ -3880,22 +3402,22 @@
                 <w:bCs w:val="false"/>
                 <w:i w:val="false"/>
                 <w:iCs w:val="false"/>
-                <w:color w:val="1a1917"/>
-                <w:sz w:val="20"/>
-                <w:szCs w:val="20"/>
-              </w:rPr>
-              <w:t xml:space="preserve">0.3</w:t>
-            </w:r>
-          </w:p>
-        </w:tc>
-        <w:tc>
-          <w:tcPr>
-            <w:tcW w:type="dxa" w:w="1149"/>
-            <w:tcBorders>
-              <w:top w:val="single" w:color="767171" w:sz="4"/>
-              <w:left w:val="single" w:color="767171" w:sz="4"/>
-              <w:bottom w:val="single" w:color="767171" w:sz="4"/>
-              <w:right w:val="single" w:color="767171" w:sz="4"/>
+                <w:color w:val="1a1a1a"/>
+                <w:sz w:val="18"/>
+                <w:szCs w:val="18"/>
+              </w:rPr>
+              <w:t xml:space="preserve">–</w:t>
+            </w:r>
+          </w:p>
+        </w:tc>
+        <w:tc>
+          <w:tcPr>
+            <w:tcW w:type="dxa" w:w="1100"/>
+            <w:tcBorders>
+              <w:top w:val="single" w:color="000000" w:sz="4"/>
+              <w:left w:val="single" w:color="000000" w:sz="4"/>
+              <w:bottom w:val="single" w:color="000000" w:sz="4"/>
+              <w:right w:val="single" w:color="000000" w:sz="4"/>
             </w:tcBorders>
             <w:tcMar>
               <w:top w:type="dxa" w:w="80"/>
@@ -3917,22 +3439,22 @@
                 <w:bCs w:val="false"/>
                 <w:i w:val="false"/>
                 <w:iCs w:val="false"/>
-                <w:color w:val="1a1917"/>
-                <w:sz w:val="20"/>
-                <w:szCs w:val="20"/>
-              </w:rPr>
-              <w:t xml:space="preserve">± 3</w:t>
-            </w:r>
-          </w:p>
-        </w:tc>
-        <w:tc>
-          <w:tcPr>
-            <w:tcW w:type="dxa" w:w="1294"/>
-            <w:tcBorders>
-              <w:top w:val="single" w:color="767171" w:sz="4"/>
-              <w:left w:val="single" w:color="767171" w:sz="4"/>
-              <w:bottom w:val="single" w:color="767171" w:sz="4"/>
-              <w:right w:val="single" w:color="767171" w:sz="4"/>
+                <w:color w:val="1a1a1a"/>
+                <w:sz w:val="18"/>
+                <w:szCs w:val="18"/>
+              </w:rPr>
+              <w:t xml:space="preserve">–</w:t>
+            </w:r>
+          </w:p>
+        </w:tc>
+        <w:tc>
+          <w:tcPr>
+            <w:tcW w:type="dxa" w:w="1100"/>
+            <w:tcBorders>
+              <w:top w:val="single" w:color="000000" w:sz="4"/>
+              <w:left w:val="single" w:color="000000" w:sz="4"/>
+              <w:bottom w:val="single" w:color="000000" w:sz="4"/>
+              <w:right w:val="single" w:color="000000" w:sz="4"/>
             </w:tcBorders>
             <w:tcMar>
               <w:top w:type="dxa" w:w="80"/>
@@ -3954,11 +3476,48 @@
                 <w:bCs w:val="false"/>
                 <w:i w:val="false"/>
                 <w:iCs w:val="false"/>
-                <w:color w:val="1a1917"/>
-                <w:sz w:val="20"/>
-                <w:szCs w:val="20"/>
-              </w:rPr>
-              <w:t xml:space="preserve">–</w:t>
+                <w:color w:val="1a1a1a"/>
+                <w:sz w:val="18"/>
+                <w:szCs w:val="18"/>
+              </w:rPr>
+              <w:t xml:space="preserve">A</w:t>
+            </w:r>
+          </w:p>
+        </w:tc>
+        <w:tc>
+          <w:tcPr>
+            <w:tcW w:type="dxa" w:w="1372"/>
+            <w:tcBorders>
+              <w:top w:val="single" w:color="000000" w:sz="4"/>
+              <w:left w:val="single" w:color="000000" w:sz="4"/>
+              <w:bottom w:val="single" w:color="000000" w:sz="4"/>
+              <w:right w:val="single" w:color="000000" w:sz="4"/>
+            </w:tcBorders>
+            <w:tcMar>
+              <w:top w:type="dxa" w:w="80"/>
+              <w:left w:type="dxa" w:w="100"/>
+              <w:bottom w:type="dxa" w:w="80"/>
+              <w:right w:type="dxa" w:w="150"/>
+            </w:tcMar>
+            <w:vAlign w:val="center"/>
+          </w:tcPr>
+          <w:p>
+            <w:pPr>
+              <w:spacing w:after="40" w:before="40"/>
+              <w:jc w:val="center"/>
+            </w:pPr>
+            <w:r>
+              <w:rPr>
+                <w:rFonts w:ascii="Arial" w:cs="Arial" w:eastAsia="Arial" w:hAnsi="Arial"/>
+                <w:b w:val="false"/>
+                <w:bCs w:val="false"/>
+                <w:i w:val="false"/>
+                <w:iCs w:val="false"/>
+                <w:color w:val="1a1a1a"/>
+                <w:sz w:val="18"/>
+                <w:szCs w:val="18"/>
+              </w:rPr>
+              <w:t xml:space="preserve">LAB-ANGLE.01 - Angle Meter</w:t>
             </w:r>
           </w:p>
         </w:tc>
@@ -3976,7 +3535,7 @@
           <w:bCs w:val="false"/>
           <w:i w:val="false"/>
           <w:iCs w:val="false"/>
-          <w:color w:val="1a1917"/>
+          <w:color w:val="1a1a1a"/>
           <w:sz w:val="20"/>
           <w:szCs w:val="20"/>
         </w:rPr>
@@ -3995,7 +3554,7 @@
           <w:bCs/>
           <w:i w:val="false"/>
           <w:iCs w:val="false"/>
-          <w:color w:val="1a1917"/>
+          <w:color w:val="1a1a1a"/>
           <w:sz w:val="20"/>
           <w:szCs w:val="20"/>
         </w:rPr>
@@ -4014,7 +3573,7 @@
           <w:bCs/>
           <w:i w:val="false"/>
           <w:iCs w:val="false"/>
-          <w:color w:val="1a1917"/>
+          <w:color w:val="1a1a1a"/>
           <w:sz w:val="20"/>
           <w:szCs w:val="20"/>
         </w:rPr>
@@ -4033,7 +3592,7 @@
           <w:bCs w:val="false"/>
           <w:i w:val="false"/>
           <w:iCs w:val="false"/>
-          <w:color w:val="1a1917"/>
+          <w:color w:val="1a1a1a"/>
           <w:sz w:val="20"/>
           <w:szCs w:val="20"/>
         </w:rPr>
@@ -4071,7 +3630,7 @@
           <w:bCs/>
           <w:i w:val="false"/>
           <w:iCs w:val="false"/>
-          <w:color w:val="1a1917"/>
+          <w:color w:val="1a1a1a"/>
           <w:sz w:val="20"/>
           <w:szCs w:val="20"/>
         </w:rPr>
@@ -4090,7 +3649,7 @@
           <w:bCs/>
           <w:i w:val="false"/>
           <w:iCs w:val="false"/>
-          <w:color w:val="1a1917"/>
+          <w:color w:val="1a1a1a"/>
           <w:sz w:val="20"/>
           <w:szCs w:val="20"/>
         </w:rPr>
@@ -4103,7 +3662,7 @@
           <w:bCs w:val="false"/>
           <w:i w:val="false"/>
           <w:iCs w:val="false"/>
-          <w:color w:val="1a1917"/>
+          <w:color w:val="1a1a1a"/>
           <w:sz w:val="20"/>
           <w:szCs w:val="20"/>
         </w:rPr>
@@ -4135,7 +3694,7 @@
           <w:bCs/>
           <w:i w:val="false"/>
           <w:iCs w:val="false"/>
-          <w:color w:val="1a1917"/>
+          <w:color w:val="1a1a1a"/>
           <w:sz w:val="20"/>
           <w:szCs w:val="20"/>
         </w:rPr>
@@ -4148,7 +3707,7 @@
           <w:bCs w:val="false"/>
           <w:i w:val="false"/>
           <w:iCs w:val="false"/>
-          <w:color w:val="1a1917"/>
+          <w:color w:val="1a1a1a"/>
           <w:sz w:val="20"/>
           <w:szCs w:val="20"/>
         </w:rPr>
@@ -4180,7 +3739,7 @@
           <w:bCs/>
           <w:i w:val="false"/>
           <w:iCs w:val="false"/>
-          <w:color w:val="1a1917"/>
+          <w:color w:val="1a1a1a"/>
           <w:sz w:val="20"/>
           <w:szCs w:val="20"/>
         </w:rPr>
@@ -4193,7 +3752,7 @@
           <w:bCs w:val="false"/>
           <w:i w:val="false"/>
           <w:iCs w:val="false"/>
-          <w:color w:val="1a1917"/>
+          <w:color w:val="1a1a1a"/>
           <w:sz w:val="20"/>
           <w:szCs w:val="20"/>
         </w:rPr>
@@ -4225,7 +3784,7 @@
           <w:bCs/>
           <w:i w:val="false"/>
           <w:iCs w:val="false"/>
-          <w:color w:val="1a1917"/>
+          <w:color w:val="1a1a1a"/>
           <w:sz w:val="20"/>
           <w:szCs w:val="20"/>
         </w:rPr>
@@ -4238,7 +3797,7 @@
           <w:bCs w:val="false"/>
           <w:i w:val="false"/>
           <w:iCs w:val="false"/>
-          <w:color w:val="1a1917"/>
+          <w:color w:val="1a1a1a"/>
           <w:sz w:val="20"/>
           <w:szCs w:val="20"/>
         </w:rPr>
@@ -4270,7 +3829,7 @@
           <w:bCs w:val="false"/>
           <w:i w:val="false"/>
           <w:iCs w:val="false"/>
-          <w:color w:val="1a1917"/>
+          <w:color w:val="1a1a1a"/>
           <w:sz w:val="20"/>
           <w:szCs w:val="20"/>
         </w:rPr>
@@ -4289,7 +3848,7 @@
           <w:bCs w:val="false"/>
           <w:i/>
           <w:iCs/>
-          <w:color w:val="6b6860"/>
+          <w:color w:val="555555"/>
           <w:sz w:val="16"/>
           <w:szCs w:val="16"/>
         </w:rPr>

</xml_diff>